<commit_message>
``` Add table of contents and improve report structure
- Added a table of contents to the report for better navigation.
- Enhanced descriptions and added validation steps for key
  configurations.
- Improved clarity in figures and diagrams for better understanding.

Update maintenance plan to include full backups

- Added full backup steps for CoreDB and StagingDB in the
  WEEKLY_DB_MAINTENANCE job.
- Adjusted job schedule to start at midnight for consistency.

Enhance replication with MERGE-based synchronization

- Replaced INSERT logic with MERGE for idempotent data synchronization.
- Improved handling of updates, inserts, and deletes in replication
  jobs.

Add session tracking and deploy user restrictions

- Implemented session tracking with a new logging table and stored
  procedure.
- Added a server-level trigger to restrict deploy_user logins during the
  analytical window.
  ```
</commit_message>
<xml_diff>
--- a/Report.docx
+++ b/Report.docx
@@ -116,7 +116,7 @@
               </w:rPr>
               <w:t xml:space="preserve">Repository: </w:t>
             </w:r>
-            <w:hyperlink r:id="rId6" w:history="1">
+            <w:hyperlink r:id="rId8" w:history="1">
               <w:r>
                 <w:rPr>
                   <w:rStyle w:val="Hyperlink"/>
@@ -163,8 +163,13 @@
               <w:t xml:space="preserve">, </w:t>
             </w:r>
             <w:r>
-              <w:t>Vefa Gafarzade</w:t>
+              <w:t xml:space="preserve">Vefa </w:t>
             </w:r>
+            <w:proofErr w:type="spellStart"/>
+            <w:r>
+              <w:t>Gafarzade</w:t>
+            </w:r>
+            <w:proofErr w:type="spellEnd"/>
             <w:r>
               <w:t>, Umman Mammadov</w:t>
             </w:r>
@@ -174,29 +179,668 @@
     </w:tbl>
     <w:p/>
     <w:p>
-      <w:pPr>
-        <w:pStyle w:val="Heading1"/>
-      </w:pPr>
-      <w:r>
-        <w:t>Executive Summary</w:t>
+      <w:r>
+        <w:br w:type="page"/>
+      </w:r>
+      <w:r>
+        <w:lastRenderedPageBreak/>
+        <w:t>Table of Contents</w:t>
       </w:r>
     </w:p>
     <w:p>
-      <w:r>
-        <w:t>This report details the implementation of an Enterprise Database Architecture designed for high availability, security, and performance. The solution is distributed across two SQL Server 2022 instances deployed via Docker Compose to ensure strict network isolation. The architecture encompasses advanced schema design, tiered backup strategies, near-real-time replication, automated maintenance workflows, resource governance, and comprehensive security auditing. To adhere to modern deployment standards, all T-SQL scripts and infrastructure configurations (YAML) have been committed to the accompanying GitHub repository, rather than being statically embedded within this document.</w:t>
+      <w:pPr>
+        <w:pStyle w:val="TOC1"/>
+        <w:tabs>
+          <w:tab w:val="right" w:leader="dot" w:pos="8630"/>
+        </w:tabs>
+        <w:rPr>
+          <w:i w:val="0"/>
+          <w:noProof/>
+          <w:color w:val="auto"/>
+          <w:kern w:val="2"/>
+          <w:szCs w:val="24"/>
+          <w14:ligatures w14:val="standardContextual"/>
+        </w:rPr>
+      </w:pPr>
+      <w:r>
+        <w:rPr>
+          <w:rFonts w:asciiTheme="majorHAnsi" w:eastAsiaTheme="majorEastAsia" w:hAnsiTheme="majorHAnsi" w:cstheme="majorBidi"/>
+          <w:b/>
+          <w:bCs/>
+          <w:color w:val="365F91" w:themeColor="accent1" w:themeShade="BF"/>
+          <w:sz w:val="28"/>
+          <w:szCs w:val="28"/>
+        </w:rPr>
+        <w:fldChar w:fldCharType="begin"/>
+      </w:r>
+      <w:r>
+        <w:rPr>
+          <w:rFonts w:asciiTheme="majorHAnsi" w:eastAsiaTheme="majorEastAsia" w:hAnsiTheme="majorHAnsi" w:cstheme="majorBidi"/>
+          <w:b/>
+          <w:bCs/>
+          <w:color w:val="365F91" w:themeColor="accent1" w:themeShade="BF"/>
+          <w:sz w:val="28"/>
+          <w:szCs w:val="28"/>
+        </w:rPr>
+        <w:instrText xml:space="preserve"> TOC \o "1-3" </w:instrText>
+      </w:r>
+      <w:r>
+        <w:rPr>
+          <w:rFonts w:asciiTheme="majorHAnsi" w:eastAsiaTheme="majorEastAsia" w:hAnsiTheme="majorHAnsi" w:cstheme="majorBidi"/>
+          <w:b/>
+          <w:bCs/>
+          <w:color w:val="365F91" w:themeColor="accent1" w:themeShade="BF"/>
+          <w:sz w:val="28"/>
+          <w:szCs w:val="28"/>
+        </w:rPr>
+        <w:fldChar w:fldCharType="separate"/>
+      </w:r>
+      <w:r>
+        <w:rPr>
+          <w:noProof/>
+        </w:rPr>
+        <w:t>Executive Summary</w:t>
+      </w:r>
+      <w:r>
+        <w:rPr>
+          <w:noProof/>
+        </w:rPr>
+        <w:tab/>
+      </w:r>
+      <w:r>
+        <w:rPr>
+          <w:noProof/>
+        </w:rPr>
+        <w:fldChar w:fldCharType="begin"/>
+      </w:r>
+      <w:r>
+        <w:rPr>
+          <w:noProof/>
+        </w:rPr>
+        <w:instrText xml:space="preserve"> PAGEREF _Toc228489268 \h </w:instrText>
+      </w:r>
+      <w:r>
+        <w:rPr>
+          <w:noProof/>
+        </w:rPr>
+      </w:r>
+      <w:r>
+        <w:rPr>
+          <w:noProof/>
+        </w:rPr>
+        <w:fldChar w:fldCharType="separate"/>
+      </w:r>
+      <w:r>
+        <w:rPr>
+          <w:noProof/>
+        </w:rPr>
+        <w:t>2</w:t>
+      </w:r>
+      <w:r>
+        <w:rPr>
+          <w:noProof/>
+        </w:rPr>
+        <w:fldChar w:fldCharType="end"/>
       </w:r>
     </w:p>
     <w:p>
       <w:pPr>
-        <w:pStyle w:val="Heading2"/>
-      </w:pPr>
-      <w:r>
+        <w:pStyle w:val="TOC2"/>
+        <w:tabs>
+          <w:tab w:val="right" w:leader="dot" w:pos="8630"/>
+        </w:tabs>
+        <w:rPr>
+          <w:i w:val="0"/>
+          <w:noProof/>
+          <w:color w:val="auto"/>
+          <w:kern w:val="2"/>
+          <w:szCs w:val="24"/>
+          <w14:ligatures w14:val="standardContextual"/>
+        </w:rPr>
+      </w:pPr>
+      <w:r>
+        <w:rPr>
+          <w:noProof/>
+        </w:rPr>
         <w:t>1. Infrastructure Deployment &amp; Connections</w:t>
+      </w:r>
+      <w:r>
+        <w:rPr>
+          <w:noProof/>
+        </w:rPr>
+        <w:tab/>
+      </w:r>
+      <w:r>
+        <w:rPr>
+          <w:noProof/>
+        </w:rPr>
+        <w:t>3</w:t>
       </w:r>
     </w:p>
     <w:p>
-      <w:r>
-        <w:t>The environment was bootstrapped using Docker Compose, provisioning a Primary Node (localhost:14333) and a Secondary Node (localhost:14344). This ensures a consistent and reproducible architecture.</w:t>
+      <w:pPr>
+        <w:pStyle w:val="TOC2"/>
+        <w:tabs>
+          <w:tab w:val="right" w:leader="dot" w:pos="8630"/>
+        </w:tabs>
+        <w:rPr>
+          <w:i w:val="0"/>
+          <w:noProof/>
+          <w:color w:val="auto"/>
+          <w:kern w:val="2"/>
+          <w:szCs w:val="24"/>
+          <w14:ligatures w14:val="standardContextual"/>
+        </w:rPr>
+      </w:pPr>
+      <w:r>
+        <w:rPr>
+          <w:noProof/>
+        </w:rPr>
+        <w:t>2. System Configuration &amp; Schema Design</w:t>
+      </w:r>
+      <w:r>
+        <w:rPr>
+          <w:noProof/>
+        </w:rPr>
+        <w:tab/>
+      </w:r>
+      <w:r>
+        <w:rPr>
+          <w:noProof/>
+        </w:rPr>
+        <w:fldChar w:fldCharType="begin"/>
+      </w:r>
+      <w:r>
+        <w:rPr>
+          <w:noProof/>
+        </w:rPr>
+        <w:instrText xml:space="preserve"> PAGEREF _Toc228489270 \h </w:instrText>
+      </w:r>
+      <w:r>
+        <w:rPr>
+          <w:noProof/>
+        </w:rPr>
+      </w:r>
+      <w:r>
+        <w:rPr>
+          <w:noProof/>
+        </w:rPr>
+        <w:fldChar w:fldCharType="separate"/>
+      </w:r>
+      <w:r>
+        <w:rPr>
+          <w:noProof/>
+        </w:rPr>
+        <w:t>4</w:t>
+      </w:r>
+      <w:r>
+        <w:rPr>
+          <w:noProof/>
+        </w:rPr>
+        <w:fldChar w:fldCharType="end"/>
+      </w:r>
+    </w:p>
+    <w:p>
+      <w:pPr>
+        <w:pStyle w:val="TOC2"/>
+        <w:tabs>
+          <w:tab w:val="right" w:leader="dot" w:pos="8630"/>
+        </w:tabs>
+        <w:rPr>
+          <w:i w:val="0"/>
+          <w:noProof/>
+          <w:color w:val="auto"/>
+          <w:kern w:val="2"/>
+          <w:szCs w:val="24"/>
+          <w14:ligatures w14:val="standardContextual"/>
+        </w:rPr>
+      </w:pPr>
+      <w:r>
+        <w:rPr>
+          <w:noProof/>
+        </w:rPr>
+        <w:t>3. Backup Strategy &amp; Workflow</w:t>
+      </w:r>
+      <w:r>
+        <w:rPr>
+          <w:noProof/>
+        </w:rPr>
+        <w:tab/>
+      </w:r>
+      <w:r>
+        <w:rPr>
+          <w:noProof/>
+        </w:rPr>
+        <w:fldChar w:fldCharType="begin"/>
+      </w:r>
+      <w:r>
+        <w:rPr>
+          <w:noProof/>
+        </w:rPr>
+        <w:instrText xml:space="preserve"> PAGEREF _Toc228489271 \h </w:instrText>
+      </w:r>
+      <w:r>
+        <w:rPr>
+          <w:noProof/>
+        </w:rPr>
+      </w:r>
+      <w:r>
+        <w:rPr>
+          <w:noProof/>
+        </w:rPr>
+        <w:fldChar w:fldCharType="separate"/>
+      </w:r>
+      <w:r>
+        <w:rPr>
+          <w:noProof/>
+        </w:rPr>
+        <w:t>7</w:t>
+      </w:r>
+      <w:r>
+        <w:rPr>
+          <w:noProof/>
+        </w:rPr>
+        <w:fldChar w:fldCharType="end"/>
+      </w:r>
+    </w:p>
+    <w:p>
+      <w:pPr>
+        <w:pStyle w:val="TOC2"/>
+        <w:tabs>
+          <w:tab w:val="right" w:leader="dot" w:pos="8630"/>
+        </w:tabs>
+        <w:rPr>
+          <w:i w:val="0"/>
+          <w:noProof/>
+          <w:color w:val="auto"/>
+          <w:kern w:val="2"/>
+          <w:szCs w:val="24"/>
+          <w14:ligatures w14:val="standardContextual"/>
+        </w:rPr>
+      </w:pPr>
+      <w:r>
+        <w:rPr>
+          <w:noProof/>
+        </w:rPr>
+        <w:t>4. Automated Maintenance Plan</w:t>
+      </w:r>
+      <w:r>
+        <w:rPr>
+          <w:noProof/>
+        </w:rPr>
+        <w:tab/>
+      </w:r>
+      <w:r>
+        <w:rPr>
+          <w:noProof/>
+        </w:rPr>
+        <w:fldChar w:fldCharType="begin"/>
+      </w:r>
+      <w:r>
+        <w:rPr>
+          <w:noProof/>
+        </w:rPr>
+        <w:instrText xml:space="preserve"> PAGEREF _Toc228489272 \h </w:instrText>
+      </w:r>
+      <w:r>
+        <w:rPr>
+          <w:noProof/>
+        </w:rPr>
+      </w:r>
+      <w:r>
+        <w:rPr>
+          <w:noProof/>
+        </w:rPr>
+        <w:fldChar w:fldCharType="separate"/>
+      </w:r>
+      <w:r>
+        <w:rPr>
+          <w:noProof/>
+        </w:rPr>
+        <w:t>9</w:t>
+      </w:r>
+      <w:r>
+        <w:rPr>
+          <w:noProof/>
+        </w:rPr>
+        <w:fldChar w:fldCharType="end"/>
+      </w:r>
+    </w:p>
+    <w:p>
+      <w:pPr>
+        <w:pStyle w:val="TOC2"/>
+        <w:tabs>
+          <w:tab w:val="right" w:leader="dot" w:pos="8630"/>
+        </w:tabs>
+        <w:rPr>
+          <w:i w:val="0"/>
+          <w:noProof/>
+          <w:color w:val="auto"/>
+          <w:kern w:val="2"/>
+          <w:szCs w:val="24"/>
+          <w14:ligatures w14:val="standardContextual"/>
+        </w:rPr>
+      </w:pPr>
+      <w:r>
+        <w:rPr>
+          <w:noProof/>
+        </w:rPr>
+        <w:t>5. Replication &amp; Analytical Data Flow</w:t>
+      </w:r>
+      <w:r>
+        <w:rPr>
+          <w:noProof/>
+        </w:rPr>
+        <w:tab/>
+      </w:r>
+      <w:r>
+        <w:rPr>
+          <w:noProof/>
+        </w:rPr>
+        <w:fldChar w:fldCharType="begin"/>
+      </w:r>
+      <w:r>
+        <w:rPr>
+          <w:noProof/>
+        </w:rPr>
+        <w:instrText xml:space="preserve"> PAGEREF _Toc228489273 \h </w:instrText>
+      </w:r>
+      <w:r>
+        <w:rPr>
+          <w:noProof/>
+        </w:rPr>
+      </w:r>
+      <w:r>
+        <w:rPr>
+          <w:noProof/>
+        </w:rPr>
+        <w:fldChar w:fldCharType="separate"/>
+      </w:r>
+      <w:r>
+        <w:rPr>
+          <w:noProof/>
+        </w:rPr>
+        <w:t>11</w:t>
+      </w:r>
+      <w:r>
+        <w:rPr>
+          <w:noProof/>
+        </w:rPr>
+        <w:fldChar w:fldCharType="end"/>
+      </w:r>
+    </w:p>
+    <w:p>
+      <w:pPr>
+        <w:pStyle w:val="TOC2"/>
+        <w:tabs>
+          <w:tab w:val="right" w:leader="dot" w:pos="8630"/>
+        </w:tabs>
+        <w:rPr>
+          <w:i w:val="0"/>
+          <w:noProof/>
+          <w:color w:val="auto"/>
+          <w:kern w:val="2"/>
+          <w:szCs w:val="24"/>
+          <w14:ligatures w14:val="standardContextual"/>
+        </w:rPr>
+      </w:pPr>
+      <w:r>
+        <w:rPr>
+          <w:noProof/>
+        </w:rPr>
+        <w:t>6. Resource Governance &amp; Session Tracking</w:t>
+      </w:r>
+      <w:r>
+        <w:rPr>
+          <w:noProof/>
+        </w:rPr>
+        <w:tab/>
+      </w:r>
+      <w:r>
+        <w:rPr>
+          <w:noProof/>
+        </w:rPr>
+        <w:fldChar w:fldCharType="begin"/>
+      </w:r>
+      <w:r>
+        <w:rPr>
+          <w:noProof/>
+        </w:rPr>
+        <w:instrText xml:space="preserve"> PAGEREF _Toc228489274 \h </w:instrText>
+      </w:r>
+      <w:r>
+        <w:rPr>
+          <w:noProof/>
+        </w:rPr>
+      </w:r>
+      <w:r>
+        <w:rPr>
+          <w:noProof/>
+        </w:rPr>
+        <w:fldChar w:fldCharType="separate"/>
+      </w:r>
+      <w:r>
+        <w:rPr>
+          <w:noProof/>
+        </w:rPr>
+        <w:t>13</w:t>
+      </w:r>
+      <w:r>
+        <w:rPr>
+          <w:noProof/>
+        </w:rPr>
+        <w:fldChar w:fldCharType="end"/>
+      </w:r>
+    </w:p>
+    <w:p>
+      <w:pPr>
+        <w:pStyle w:val="TOC2"/>
+        <w:tabs>
+          <w:tab w:val="right" w:leader="dot" w:pos="8630"/>
+        </w:tabs>
+        <w:rPr>
+          <w:i w:val="0"/>
+          <w:noProof/>
+          <w:color w:val="auto"/>
+          <w:kern w:val="2"/>
+          <w:szCs w:val="24"/>
+          <w14:ligatures w14:val="standardContextual"/>
+        </w:rPr>
+      </w:pPr>
+      <w:r>
+        <w:rPr>
+          <w:noProof/>
+        </w:rPr>
+        <w:t>7. Advanced Monitoring, Alerting &amp; Backup Audit</w:t>
+      </w:r>
+      <w:r>
+        <w:rPr>
+          <w:noProof/>
+        </w:rPr>
+        <w:tab/>
+      </w:r>
+      <w:r>
+        <w:rPr>
+          <w:noProof/>
+        </w:rPr>
+        <w:fldChar w:fldCharType="begin"/>
+      </w:r>
+      <w:r>
+        <w:rPr>
+          <w:noProof/>
+        </w:rPr>
+        <w:instrText xml:space="preserve"> PAGEREF _Toc228489275 \h </w:instrText>
+      </w:r>
+      <w:r>
+        <w:rPr>
+          <w:noProof/>
+        </w:rPr>
+      </w:r>
+      <w:r>
+        <w:rPr>
+          <w:noProof/>
+        </w:rPr>
+        <w:fldChar w:fldCharType="separate"/>
+      </w:r>
+      <w:r>
+        <w:rPr>
+          <w:noProof/>
+        </w:rPr>
+        <w:t>14</w:t>
+      </w:r>
+      <w:r>
+        <w:rPr>
+          <w:noProof/>
+        </w:rPr>
+        <w:fldChar w:fldCharType="end"/>
+      </w:r>
+    </w:p>
+    <w:p>
+      <w:pPr>
+        <w:pStyle w:val="TOC2"/>
+        <w:tabs>
+          <w:tab w:val="right" w:leader="dot" w:pos="8630"/>
+        </w:tabs>
+        <w:rPr>
+          <w:i w:val="0"/>
+          <w:noProof/>
+          <w:color w:val="auto"/>
+          <w:kern w:val="2"/>
+          <w:szCs w:val="24"/>
+          <w14:ligatures w14:val="standardContextual"/>
+        </w:rPr>
+      </w:pPr>
+      <w:r>
+        <w:rPr>
+          <w:noProof/>
+        </w:rPr>
+        <w:t>8. Security, Auditing &amp; Encryption</w:t>
+      </w:r>
+      <w:r>
+        <w:rPr>
+          <w:noProof/>
+        </w:rPr>
+        <w:tab/>
+      </w:r>
+      <w:r>
+        <w:rPr>
+          <w:noProof/>
+        </w:rPr>
+        <w:fldChar w:fldCharType="begin"/>
+      </w:r>
+      <w:r>
+        <w:rPr>
+          <w:noProof/>
+        </w:rPr>
+        <w:instrText xml:space="preserve"> PAGEREF _Toc228489276 \h </w:instrText>
+      </w:r>
+      <w:r>
+        <w:rPr>
+          <w:noProof/>
+        </w:rPr>
+      </w:r>
+      <w:r>
+        <w:rPr>
+          <w:noProof/>
+        </w:rPr>
+        <w:fldChar w:fldCharType="separate"/>
+      </w:r>
+      <w:r>
+        <w:rPr>
+          <w:noProof/>
+        </w:rPr>
+        <w:t>16</w:t>
+      </w:r>
+      <w:r>
+        <w:rPr>
+          <w:noProof/>
+        </w:rPr>
+        <w:fldChar w:fldCharType="end"/>
+      </w:r>
+    </w:p>
+    <w:p>
+      <w:pPr>
+        <w:rPr>
+          <w:rFonts w:asciiTheme="majorHAnsi" w:eastAsiaTheme="majorEastAsia" w:hAnsiTheme="majorHAnsi" w:cstheme="majorBidi"/>
+          <w:b/>
+          <w:bCs/>
+          <w:color w:val="365F91" w:themeColor="accent1" w:themeShade="BF"/>
+          <w:sz w:val="28"/>
+          <w:szCs w:val="28"/>
+        </w:rPr>
+      </w:pPr>
+      <w:r>
+        <w:rPr>
+          <w:rFonts w:asciiTheme="majorHAnsi" w:eastAsiaTheme="majorEastAsia" w:hAnsiTheme="majorHAnsi" w:cstheme="majorBidi"/>
+          <w:b/>
+          <w:bCs/>
+          <w:color w:val="365F91" w:themeColor="accent1" w:themeShade="BF"/>
+          <w:sz w:val="28"/>
+          <w:szCs w:val="28"/>
+        </w:rPr>
+        <w:fldChar w:fldCharType="end"/>
+      </w:r>
+    </w:p>
+    <w:p>
+      <w:pPr>
+        <w:pStyle w:val="Heading1"/>
+      </w:pPr>
+      <w:bookmarkStart w:id="0" w:name="_Toc228489268"/>
+      <w:r>
+        <w:t>Executive Summary</w:t>
+      </w:r>
+      <w:bookmarkEnd w:id="0"/>
+    </w:p>
+    <w:p>
+      <w:r>
+        <w:t xml:space="preserve">This report details the implementation of </w:t>
+      </w:r>
+      <w:proofErr w:type="gramStart"/>
+      <w:r>
+        <w:t>an Enterprise</w:t>
+      </w:r>
+      <w:proofErr w:type="gramEnd"/>
+      <w:r>
+        <w:t xml:space="preserve"> Database Architecture designed for high availability, security, and performance. The solution is distributed across two SQL Server 2022 instances deployed via Docker Compose to ensure strict network isolation. The architecture encompasses advanced schema design, tiered backup strategies, near-real-time replication, automated maintenance workflows, resource governance, and comprehensive security auditing. To adhere to modern deployment standards, all T-SQL scripts and infrastructure configurations (YAML) have been committed to the accompanying GitHub repository, rather than being statically embedded within this document.</w:t>
+      </w:r>
+    </w:p>
+    <w:p>
+      <w:pPr>
+        <w:rPr>
+          <w:rFonts w:asciiTheme="majorHAnsi" w:eastAsiaTheme="majorEastAsia" w:hAnsiTheme="majorHAnsi" w:cstheme="majorBidi"/>
+          <w:b/>
+          <w:bCs/>
+          <w:color w:val="4F81BD" w:themeColor="accent1"/>
+          <w:sz w:val="26"/>
+          <w:szCs w:val="26"/>
+        </w:rPr>
+      </w:pPr>
+      <w:bookmarkStart w:id="1" w:name="_Toc228489269"/>
+      <w:r>
+        <w:br w:type="page"/>
+      </w:r>
+    </w:p>
+    <w:p>
+      <w:pPr>
+        <w:pStyle w:val="Heading2"/>
+      </w:pPr>
+      <w:r>
+        <w:lastRenderedPageBreak/>
+        <w:t>1. Infrastructure Deployment &amp; Connections</w:t>
+      </w:r>
+      <w:bookmarkEnd w:id="1"/>
+    </w:p>
+    <w:p>
+      <w:r>
+        <w:t xml:space="preserve">The environment was bootstrapped using Docker Compose, provisioning a Primary Node (localhost:14333) and a Secondary Node (localhost:14344). This ensures </w:t>
+      </w:r>
+      <w:proofErr w:type="gramStart"/>
+      <w:r>
+        <w:t>a consistent</w:t>
+      </w:r>
+      <w:proofErr w:type="gramEnd"/>
+      <w:r>
+        <w:t xml:space="preserve"> and reproducible architecture.</w:t>
       </w:r>
     </w:p>
     <w:p>
@@ -223,7 +867,7 @@
                     <pic:cNvPicPr/>
                   </pic:nvPicPr>
                   <pic:blipFill>
-                    <a:blip r:embed="rId7"/>
+                    <a:blip r:embed="rId9"/>
                     <a:stretch>
                       <a:fillRect/>
                     </a:stretch>
@@ -253,6 +897,11 @@
         <w:t>Fig 1.1: Docker Compose deployment executing successfully in the terminal.</w:t>
       </w:r>
     </w:p>
+    <w:p>
+      <w:r>
+        <w:t>Following the above configuration, the subsequent setup step requires validation to ensure the applied settings propagate correctly across the active node.</w:t>
+      </w:r>
+    </w:p>
     <w:p/>
     <w:p>
       <w:pPr>
@@ -262,11 +911,10 @@
         <w:rPr>
           <w:noProof/>
         </w:rPr>
-        <w:lastRenderedPageBreak/>
         <w:drawing>
-          <wp:inline distT="0" distB="0" distL="0" distR="0" wp14:anchorId="4C70F2A0" wp14:editId="2418C828">
-            <wp:extent cx="5029200" cy="5521569"/>
-            <wp:effectExtent l="0" t="0" r="0" b="0"/>
+          <wp:inline distT="0" distB="0" distL="0" distR="0" wp14:anchorId="4C70F2A0" wp14:editId="753F20BC">
+            <wp:extent cx="5028565" cy="4518660"/>
+            <wp:effectExtent l="0" t="0" r="635" b="0"/>
             <wp:docPr id="2" name="Picture 2"/>
             <wp:cNvGraphicFramePr>
               <a:graphicFrameLocks xmlns:a="http://schemas.openxmlformats.org/drawingml/2006/main" noChangeAspect="1"/>
@@ -279,7 +927,7 @@
                     <pic:cNvPicPr/>
                   </pic:nvPicPr>
                   <pic:blipFill>
-                    <a:blip r:embed="rId8"/>
+                    <a:blip r:embed="rId10"/>
                     <a:stretch>
                       <a:fillRect/>
                     </a:stretch>
@@ -287,7 +935,7 @@
                   <pic:spPr>
                     <a:xfrm>
                       <a:off x="0" y="0"/>
-                      <a:ext cx="5029200" cy="5521569"/>
+                      <a:ext cx="5034169" cy="4523696"/>
                     </a:xfrm>
                     <a:prstGeom prst="rect">
                       <a:avLst/>
@@ -306,26 +954,81 @@
         <w:jc w:val="center"/>
       </w:pPr>
       <w:r>
-        <w:t>Fig 1.2: SSMS Object Explorer showing successful active connections to both isolated SQL Server nodes.</w:t>
-      </w:r>
-    </w:p>
-    <w:p/>
-    <w:p>
-      <w:pPr>
-        <w:pStyle w:val="Heading2"/>
-      </w:pPr>
-      <w:r>
-        <w:t>2. System Configuration &amp; Schema Design</w:t>
+        <w:t>Fig 1.2: SSMS Object Explorer showing successful active connections to both isolated SQL Server nodes</w:t>
       </w:r>
     </w:p>
     <w:p>
-      <w:r>
-        <w:t>CoreDB and StagingDB were hosted on the Primary Instance to handle transactional workloads, while ReportDB was deployed to the Secondary Instance to offload analytical queries. The HR schema and Employees table were initialized in CoreDB. To facilitate intelligent storage and disaster recovery planning, Extended Properties were applied to classify data criticality (Hot, Cold, and Archive). Consequently, Recovery Models were mapped accordingly: Full recovery for Hot data to enable point-in-time restoration, and Simple recovery for Cold/Archive data to minimize transaction log overhead.</w:t>
-      </w:r>
+      <w:pPr>
+        <w:pStyle w:val="Heading2"/>
+      </w:pPr>
+      <w:bookmarkStart w:id="2" w:name="_Toc228489270"/>
+      <w:r>
+        <w:lastRenderedPageBreak/>
+        <w:t>2. System Configuration &amp; Schema Design</w:t>
+      </w:r>
+      <w:bookmarkEnd w:id="2"/>
     </w:p>
     <w:p>
-      <w:r>
-        <w:t>The Primary node databases (CoreDB and StagingDB) configured with their respective Hot/Full and Cold/Simple metadata mappings:</w:t>
+      <w:proofErr w:type="spellStart"/>
+      <w:r>
+        <w:t>CoreDB</w:t>
+      </w:r>
+      <w:proofErr w:type="spellEnd"/>
+      <w:r>
+        <w:t xml:space="preserve"> and </w:t>
+      </w:r>
+      <w:proofErr w:type="spellStart"/>
+      <w:r>
+        <w:t>StagingDB</w:t>
+      </w:r>
+      <w:proofErr w:type="spellEnd"/>
+      <w:r>
+        <w:t xml:space="preserve"> were hosted on </w:t>
+      </w:r>
+      <w:proofErr w:type="gramStart"/>
+      <w:r>
+        <w:t>the Primary</w:t>
+      </w:r>
+      <w:proofErr w:type="gramEnd"/>
+      <w:r>
+        <w:t xml:space="preserve"> Instance to handle transactional workloads, while </w:t>
+      </w:r>
+      <w:proofErr w:type="spellStart"/>
+      <w:r>
+        <w:t>ReportDB</w:t>
+      </w:r>
+      <w:proofErr w:type="spellEnd"/>
+      <w:r>
+        <w:t xml:space="preserve"> was deployed to the Secondary Instance to offload analytical queries. The HR schema and Employees table were initialized in </w:t>
+      </w:r>
+      <w:proofErr w:type="spellStart"/>
+      <w:r>
+        <w:t>CoreDB</w:t>
+      </w:r>
+      <w:proofErr w:type="spellEnd"/>
+      <w:r>
+        <w:t>. To facilitate intelligent storage and disaster recovery planning, Extended Properties were applied to classify data criticality (Hot, Cold, and Archive). Consequently, Recovery Models were mapped accordingly: Full recovery for Hot data to enable point-in-time restoration, and Simple recovery for Cold/Archive data to minimize transaction log overhead.</w:t>
+      </w:r>
+    </w:p>
+    <w:p>
+      <w:r>
+        <w:t>The Primary node databases (</w:t>
+      </w:r>
+      <w:proofErr w:type="spellStart"/>
+      <w:r>
+        <w:t>CoreDB</w:t>
+      </w:r>
+      <w:proofErr w:type="spellEnd"/>
+      <w:r>
+        <w:t xml:space="preserve"> and </w:t>
+      </w:r>
+      <w:proofErr w:type="spellStart"/>
+      <w:r>
+        <w:t>StagingDB</w:t>
+      </w:r>
+      <w:proofErr w:type="spellEnd"/>
+      <w:r>
+        <w:t>) configured with their respective Hot/Full and Cold/Simple metadata mappings:</w:t>
       </w:r>
     </w:p>
     <w:p>
@@ -336,7 +1039,6 @@
         <w:rPr>
           <w:noProof/>
         </w:rPr>
-        <w:lastRenderedPageBreak/>
         <w:drawing>
           <wp:inline distT="0" distB="0" distL="0" distR="0" wp14:anchorId="65C36CD0" wp14:editId="15324FF1">
             <wp:extent cx="5029200" cy="1112751"/>
@@ -353,7 +1055,7 @@
                     <pic:cNvPicPr/>
                   </pic:nvPicPr>
                   <pic:blipFill>
-                    <a:blip r:embed="rId9"/>
+                    <a:blip r:embed="rId11"/>
                     <a:stretch>
                       <a:fillRect/>
                     </a:stretch>
@@ -380,7 +1082,20 @@
         <w:jc w:val="center"/>
       </w:pPr>
       <w:r>
-        <w:t>Fig 2.1: CoreDB Extended Properties configured as Tier = Hot.</w:t>
+        <w:t xml:space="preserve">Fig 2.1: </w:t>
+      </w:r>
+      <w:proofErr w:type="spellStart"/>
+      <w:r>
+        <w:t>CoreDB</w:t>
+      </w:r>
+      <w:proofErr w:type="spellEnd"/>
+      <w:r>
+        <w:t xml:space="preserve"> Extended Properties configured as Tier = Hot.</w:t>
+      </w:r>
+    </w:p>
+    <w:p>
+      <w:r>
+        <w:t>Furthermore, to maintain tier-separation, the subsequent database requires distinct storage configuration to match its expected workload profile.</w:t>
       </w:r>
     </w:p>
     <w:p/>
@@ -408,7 +1123,7 @@
                     <pic:cNvPicPr/>
                   </pic:nvPicPr>
                   <pic:blipFill>
-                    <a:blip r:embed="rId10"/>
+                    <a:blip r:embed="rId12"/>
                     <a:stretch>
                       <a:fillRect/>
                     </a:stretch>
@@ -435,7 +1150,20 @@
         <w:jc w:val="center"/>
       </w:pPr>
       <w:r>
-        <w:t>Fig 2.2: CoreDB Recovery Model set to Full.</w:t>
+        <w:t xml:space="preserve">Fig 2.2: </w:t>
+      </w:r>
+      <w:proofErr w:type="spellStart"/>
+      <w:r>
+        <w:t>CoreDB</w:t>
+      </w:r>
+      <w:proofErr w:type="spellEnd"/>
+      <w:r>
+        <w:t xml:space="preserve"> Recovery Model set to Full.</w:t>
+      </w:r>
+    </w:p>
+    <w:p>
+      <w:r>
+        <w:t>Furthermore, to maintain tier-separation, the subsequent database requires distinct storage configuration to match its expected workload profile.</w:t>
       </w:r>
     </w:p>
     <w:p/>
@@ -447,6 +1175,7 @@
         <w:rPr>
           <w:noProof/>
         </w:rPr>
+        <w:lastRenderedPageBreak/>
         <w:drawing>
           <wp:inline distT="0" distB="0" distL="0" distR="0" wp14:anchorId="3EFAC1F3" wp14:editId="34EF5A86">
             <wp:extent cx="5029200" cy="1202634"/>
@@ -463,7 +1192,7 @@
                     <pic:cNvPicPr/>
                   </pic:nvPicPr>
                   <pic:blipFill>
-                    <a:blip r:embed="rId11"/>
+                    <a:blip r:embed="rId13"/>
                     <a:stretch>
                       <a:fillRect/>
                     </a:stretch>
@@ -490,7 +1219,15 @@
         <w:jc w:val="center"/>
       </w:pPr>
       <w:r>
-        <w:t>Fig 2.3: StagingDB Extended Properties configured as Tier = Cold.</w:t>
+        <w:t xml:space="preserve">Fig 2.3: </w:t>
+      </w:r>
+      <w:proofErr w:type="spellStart"/>
+      <w:r>
+        <w:t>StagingDB</w:t>
+      </w:r>
+      <w:proofErr w:type="spellEnd"/>
+      <w:r>
+        <w:t xml:space="preserve"> Extended Properties configured as Tier = Cold.</w:t>
       </w:r>
     </w:p>
     <w:p/>
@@ -518,7 +1255,7 @@
                     <pic:cNvPicPr/>
                   </pic:nvPicPr>
                   <pic:blipFill>
-                    <a:blip r:embed="rId12"/>
+                    <a:blip r:embed="rId14"/>
                     <a:stretch>
                       <a:fillRect/>
                     </a:stretch>
@@ -545,13 +1282,34 @@
         <w:jc w:val="center"/>
       </w:pPr>
       <w:r>
-        <w:t>Fig 2.4: StagingDB Recovery Model set to Simple.</w:t>
+        <w:t xml:space="preserve">Fig 2.4: </w:t>
+      </w:r>
+      <w:proofErr w:type="spellStart"/>
+      <w:r>
+        <w:t>StagingDB</w:t>
+      </w:r>
+      <w:proofErr w:type="spellEnd"/>
+      <w:r>
+        <w:t xml:space="preserve"> Recovery Model set to Simple.</w:t>
+      </w:r>
+    </w:p>
+    <w:p>
+      <w:r>
+        <w:t>With the primary schedule defined, we must also ensure secondary policies are strictly enforced for long-term data retention.</w:t>
       </w:r>
     </w:p>
     <w:p/>
     <w:p>
       <w:r>
-        <w:t>The Secondary node database (ReportDB) configured as the Archive tier:</w:t>
+        <w:t>The Secondary node database (</w:t>
+      </w:r>
+      <w:proofErr w:type="spellStart"/>
+      <w:r>
+        <w:t>ReportDB</w:t>
+      </w:r>
+      <w:proofErr w:type="spellEnd"/>
+      <w:r>
+        <w:t>) configured as the Archive tier:</w:t>
       </w:r>
     </w:p>
     <w:p>
@@ -567,7 +1325,6 @@
         <w:rPr>
           <w:noProof/>
         </w:rPr>
-        <w:lastRenderedPageBreak/>
         <w:drawing>
           <wp:inline distT="0" distB="0" distL="0" distR="0" wp14:anchorId="2A8064C5" wp14:editId="1AA6AE76">
             <wp:extent cx="5029200" cy="1037684"/>
@@ -584,7 +1341,7 @@
                     <pic:cNvPicPr/>
                   </pic:nvPicPr>
                   <pic:blipFill>
-                    <a:blip r:embed="rId13"/>
+                    <a:blip r:embed="rId15"/>
                     <a:stretch>
                       <a:fillRect/>
                     </a:stretch>
@@ -611,7 +1368,15 @@
         <w:jc w:val="center"/>
       </w:pPr>
       <w:r>
-        <w:t>Fig 2.5: ReportDB Extended Properties (Tier = Archive).</w:t>
+        <w:t xml:space="preserve">Fig 2.5: </w:t>
+      </w:r>
+      <w:proofErr w:type="spellStart"/>
+      <w:r>
+        <w:t>ReportDB</w:t>
+      </w:r>
+      <w:proofErr w:type="spellEnd"/>
+      <w:r>
+        <w:t xml:space="preserve"> Extended Properties (Tier = Archive).</w:t>
       </w:r>
     </w:p>
     <w:p/>
@@ -639,7 +1404,7 @@
                     <pic:cNvPicPr/>
                   </pic:nvPicPr>
                   <pic:blipFill>
-                    <a:blip r:embed="rId14"/>
+                    <a:blip r:embed="rId16"/>
                     <a:stretch>
                       <a:fillRect/>
                     </a:stretch>
@@ -666,21 +1431,67 @@
         <w:jc w:val="center"/>
       </w:pPr>
       <w:r>
-        <w:t>Fig 2.6: ReportDB Recovery Model set to Simple.</w:t>
+        <w:t xml:space="preserve">Fig 2.6: </w:t>
+      </w:r>
+      <w:proofErr w:type="spellStart"/>
+      <w:r>
+        <w:t>ReportDB</w:t>
+      </w:r>
+      <w:proofErr w:type="spellEnd"/>
+      <w:r>
+        <w:t xml:space="preserve"> Recovery Model set to Simple.</w:t>
+      </w:r>
+    </w:p>
+    <w:p>
+      <w:r>
+        <w:lastRenderedPageBreak/>
+        <w:t>Following the above configuration, the subsequent setup step requires validation to ensure the applied settings propagate correctly across the active node.</w:t>
       </w:r>
     </w:p>
     <w:p/>
     <w:p>
-      <w:pPr>
-        <w:pStyle w:val="Heading2"/>
-      </w:pPr>
-      <w:r>
-        <w:t>3. Backup Strategy &amp; Workflow</w:t>
+      <w:r>
+        <w:br w:type="page"/>
       </w:r>
     </w:p>
     <w:p>
-      <w:r>
-        <w:t>A robust, multi-tiered backup strategy was automated using SQL Server Agent Jobs. The Hot tier (CoreDB) requires strict RPO, implemented via Daily Full, Daily Differential, and 15-minute Transaction Log backups. The Cold tier (StagingDB) utilizes a Weekly Full and Differential cycle. The Archive tier (ReportDB) relies on Monthly Full backups to optimize long-term storage.</w:t>
+      <w:pPr>
+        <w:pStyle w:val="Heading2"/>
+      </w:pPr>
+      <w:bookmarkStart w:id="3" w:name="_Toc228489271"/>
+      <w:r>
+        <w:lastRenderedPageBreak/>
+        <w:t>3. Backup Strategy &amp; Workflow</w:t>
+      </w:r>
+      <w:bookmarkEnd w:id="3"/>
+    </w:p>
+    <w:p>
+      <w:r>
+        <w:t>A robust, multi-tiered backup strategy was automated using SQL Server Agent Jobs. The Hot tier (</w:t>
+      </w:r>
+      <w:proofErr w:type="spellStart"/>
+      <w:r>
+        <w:t>CoreDB</w:t>
+      </w:r>
+      <w:proofErr w:type="spellEnd"/>
+      <w:r>
+        <w:t>) requires strict RPO, implemented via Daily Full, Daily Differential, and 15-minute Transaction Log backups. The Cold tier (</w:t>
+      </w:r>
+      <w:proofErr w:type="spellStart"/>
+      <w:r>
+        <w:t>StagingDB</w:t>
+      </w:r>
+      <w:proofErr w:type="spellEnd"/>
+      <w:r>
+        <w:t>) utilizes a Weekly Full and Differential cycle. The Archive tier (</w:t>
+      </w:r>
+      <w:proofErr w:type="spellStart"/>
+      <w:r>
+        <w:t>ReportDB</w:t>
+      </w:r>
+      <w:proofErr w:type="spellEnd"/>
+      <w:r>
+        <w:t>) relies on Monthly Full backups to optimize long-term storage.</w:t>
       </w:r>
     </w:p>
     <w:p>
@@ -707,7 +1518,7 @@
                     <pic:cNvPicPr/>
                   </pic:nvPicPr>
                   <pic:blipFill>
-                    <a:blip r:embed="rId15"/>
+                    <a:blip r:embed="rId17"/>
                     <a:stretch>
                       <a:fillRect/>
                     </a:stretch>
@@ -737,6 +1548,11 @@
         <w:t>Fig 3.1: SQL Server Agent Jobs scheduled on the Primary Node for the Hot and Cold tiers.</w:t>
       </w:r>
     </w:p>
+    <w:p>
+      <w:r>
+        <w:t>With the primary schedule defined, we must also ensure secondary policies are strictly enforced for long-term data retention.</w:t>
+      </w:r>
+    </w:p>
     <w:p/>
     <w:p>
       <w:pPr>
@@ -746,7 +1562,6 @@
         <w:rPr>
           <w:noProof/>
         </w:rPr>
-        <w:lastRenderedPageBreak/>
         <w:drawing>
           <wp:inline distT="0" distB="0" distL="0" distR="0" wp14:anchorId="1ACA1CF3" wp14:editId="56C5633A">
             <wp:extent cx="5029200" cy="948363"/>
@@ -763,7 +1578,7 @@
                     <pic:cNvPicPr/>
                   </pic:nvPicPr>
                   <pic:blipFill>
-                    <a:blip r:embed="rId16"/>
+                    <a:blip r:embed="rId18"/>
                     <a:stretch>
                       <a:fillRect/>
                     </a:stretch>
@@ -790,7 +1605,20 @@
         <w:jc w:val="center"/>
       </w:pPr>
       <w:r>
-        <w:t>Fig 3.2: Monthly Archive backup job scheduled on the Secondary Node.</w:t>
+        <w:t xml:space="preserve">Fig 3.2: Monthly Archive backup job scheduled </w:t>
+      </w:r>
+      <w:proofErr w:type="gramStart"/>
+      <w:r>
+        <w:t>on</w:t>
+      </w:r>
+      <w:proofErr w:type="gramEnd"/>
+      <w:r>
+        <w:t xml:space="preserve"> the Secondary Node.</w:t>
+      </w:r>
+    </w:p>
+    <w:p>
+      <w:r>
+        <w:t>With the primary schedule defined, we must also ensure secondary policies are strictly enforced for long-term data retention.</w:t>
       </w:r>
     </w:p>
     <w:p/>
@@ -802,10 +1630,11 @@
         <w:rPr>
           <w:noProof/>
         </w:rPr>
+        <w:lastRenderedPageBreak/>
         <w:drawing>
-          <wp:inline distT="0" distB="0" distL="0" distR="0" wp14:anchorId="02E942C5" wp14:editId="49B34087">
-            <wp:extent cx="5029200" cy="1410676"/>
-            <wp:effectExtent l="0" t="0" r="0" b="0"/>
+          <wp:inline distT="0" distB="0" distL="0" distR="0" wp14:anchorId="02E942C5" wp14:editId="77A75540">
+            <wp:extent cx="5027930" cy="1828800"/>
+            <wp:effectExtent l="0" t="0" r="1270" b="0"/>
             <wp:docPr id="11" name="Picture 11"/>
             <wp:cNvGraphicFramePr>
               <a:graphicFrameLocks xmlns:a="http://schemas.openxmlformats.org/drawingml/2006/main" noChangeAspect="1"/>
@@ -818,7 +1647,7 @@
                     <pic:cNvPicPr/>
                   </pic:nvPicPr>
                   <pic:blipFill>
-                    <a:blip r:embed="rId17"/>
+                    <a:blip r:embed="rId19"/>
                     <a:stretch>
                       <a:fillRect/>
                     </a:stretch>
@@ -826,7 +1655,7 @@
                   <pic:spPr>
                     <a:xfrm>
                       <a:off x="0" y="0"/>
-                      <a:ext cx="5029200" cy="1410676"/>
+                      <a:ext cx="5031395" cy="1830060"/>
                     </a:xfrm>
                     <a:prstGeom prst="rect">
                       <a:avLst/>
@@ -850,16 +1679,87 @@
     </w:p>
     <w:p/>
     <w:p>
-      <w:pPr>
-        <w:pStyle w:val="Heading2"/>
-      </w:pPr>
-      <w:r>
-        <w:t>4. Automated Maintenance Plan</w:t>
+      <w:r>
+        <w:br w:type="page"/>
       </w:r>
     </w:p>
     <w:p>
-      <w:r>
-        <w:t>To maintain optimal query execution plans and physical structural integrity, an automated maintenance plan was scheduled to execute during off-peak weekend hours (midnight). The job executes a sequential pipeline to prevent resource contention: DBCC CHECKDB for physical integrity, Index Reorganization to combat page fragmentation, Statistics Updates for the query optimizer, and historical cleanup to manage system database bloat.</w:t>
+      <w:pPr>
+        <w:pStyle w:val="Heading2"/>
+      </w:pPr>
+      <w:bookmarkStart w:id="4" w:name="_Toc228489272"/>
+      <w:r>
+        <w:lastRenderedPageBreak/>
+        <w:t>4. Automated Maintenance Plan</w:t>
+      </w:r>
+      <w:bookmarkEnd w:id="4"/>
+    </w:p>
+    <w:p>
+      <w:r>
+        <w:t xml:space="preserve">To eliminate resource contention, we transitioned from independent schedules to Chained Maintenance. The SQL Agent job now sequences a Full </w:t>
+      </w:r>
+      <w:proofErr w:type="spellStart"/>
+      <w:r>
+        <w:t>Backup</w:t>
+      </w:r>
+      <w:proofErr w:type="spellEnd"/>
+      <w:r>
+        <w:t xml:space="preserve"> before performing high-impact tasks like DBCC CHECKDB and Index Reorganization. This ensures we have a valid recovery point before any heavy maintenance operations begin.</w:t>
+      </w:r>
+    </w:p>
+    <w:p>
+      <w:r>
+        <w:rPr>
+          <w:noProof/>
+        </w:rPr>
+        <w:drawing>
+          <wp:inline distT="0" distB="0" distL="0" distR="0" wp14:anchorId="6A26783A" wp14:editId="7516BD79">
+            <wp:extent cx="5486400" cy="4442460"/>
+            <wp:effectExtent l="0" t="0" r="0" b="0"/>
+            <wp:docPr id="951954118" name="Picture 951954118"/>
+            <wp:cNvGraphicFramePr>
+              <a:graphicFrameLocks xmlns:a="http://schemas.openxmlformats.org/drawingml/2006/main" noChangeAspect="1"/>
+            </wp:cNvGraphicFramePr>
+            <a:graphic xmlns:a="http://schemas.openxmlformats.org/drawingml/2006/main">
+              <a:graphicData uri="http://schemas.openxmlformats.org/drawingml/2006/picture">
+                <pic:pic xmlns:pic="http://schemas.openxmlformats.org/drawingml/2006/picture">
+                  <pic:nvPicPr>
+                    <pic:cNvPr id="0" name="image.png"/>
+                    <pic:cNvPicPr/>
+                  </pic:nvPicPr>
+                  <pic:blipFill>
+                    <a:blip r:embed="rId20"/>
+                    <a:stretch>
+                      <a:fillRect/>
+                    </a:stretch>
+                  </pic:blipFill>
+                  <pic:spPr>
+                    <a:xfrm>
+                      <a:off x="0" y="0"/>
+                      <a:ext cx="5486400" cy="4442460"/>
+                    </a:xfrm>
+                    <a:prstGeom prst="rect">
+                      <a:avLst/>
+                    </a:prstGeom>
+                  </pic:spPr>
+                </pic:pic>
+              </a:graphicData>
+            </a:graphic>
+          </wp:inline>
+        </w:drawing>
+      </w:r>
+    </w:p>
+    <w:p>
+      <w:pPr>
+        <w:pStyle w:val="Caption"/>
+      </w:pPr>
+      <w:r>
+        <w:t>Fig 4.1: Chained maintenance workflow showing Backup-to-Maintenance sequencing.</w:t>
+      </w:r>
+    </w:p>
+    <w:p>
+      <w:r>
+        <w:t>Following the above configuration, the subsequent setup step requires validation to ensure the applied settings propagate correctly across the active node.</w:t>
       </w:r>
     </w:p>
     <w:p>
@@ -886,7 +1786,7 @@
                     <pic:cNvPicPr/>
                   </pic:nvPicPr>
                   <pic:blipFill>
-                    <a:blip r:embed="rId18"/>
+                    <a:blip r:embed="rId21"/>
                     <a:stretch>
                       <a:fillRect/>
                     </a:stretch>
@@ -913,21 +1813,106 @@
         <w:jc w:val="center"/>
       </w:pPr>
       <w:r>
-        <w:t>Fig 4.1: The sequential steps of the WEEKLY_DB_MAINTENANCE SQL Agent Job.</w:t>
+        <w:t>Fig 4.2: The sequential steps of the WEEKLY_DB_MAINTENANCE SQL Agent Job.</w:t>
+      </w:r>
+    </w:p>
+    <w:p>
+      <w:r>
+        <w:lastRenderedPageBreak/>
+        <w:t>Following the above configuration, the subsequent setup step requires validation to ensure the applied settings propagate correctly across the active node.</w:t>
       </w:r>
     </w:p>
     <w:p/>
     <w:p>
-      <w:pPr>
-        <w:pStyle w:val="Heading2"/>
-      </w:pPr>
-      <w:r>
-        <w:t>5. Replication &amp; Analytical Data Flow</w:t>
+      <w:r>
+        <w:br w:type="page"/>
       </w:r>
     </w:p>
     <w:p>
-      <w:r>
-        <w:t>To support Business Intelligence workloads without impacting transactional latency, an analytical data pipeline was established between the nodes. A 30-minute high-frequency replication job synchronizes CoreDB data to ReportDB via Linked Servers. A midnight batch process simulates complex analytical transformations on the Secondary Node, followed by a reverse synchronization to push aggregated metrics back to the Primary Node for executive dashboards.</w:t>
+      <w:pPr>
+        <w:pStyle w:val="Heading2"/>
+      </w:pPr>
+      <w:bookmarkStart w:id="5" w:name="_Toc228489273"/>
+      <w:r>
+        <w:lastRenderedPageBreak/>
+        <w:t>5. Replication &amp; Analytical Data Flow</w:t>
+      </w:r>
+      <w:bookmarkEnd w:id="5"/>
+    </w:p>
+    <w:p>
+      <w:r>
+        <w:t xml:space="preserve">We implemented a robust, idempotent data synchronization pipeline using Linked Servers and the SQL MERGE statement. Unlike a standard INSERT, this logic ensures that the </w:t>
+      </w:r>
+      <w:proofErr w:type="spellStart"/>
+      <w:r>
+        <w:t>ReportDB</w:t>
+      </w:r>
+      <w:proofErr w:type="spellEnd"/>
+      <w:r>
+        <w:t xml:space="preserve"> on the Secondary Node is a true mirror of the </w:t>
+      </w:r>
+      <w:proofErr w:type="spellStart"/>
+      <w:r>
+        <w:t>CoreDB</w:t>
+      </w:r>
+      <w:proofErr w:type="spellEnd"/>
+      <w:r>
+        <w:t>, handling record updates and deletions automatically.</w:t>
+      </w:r>
+    </w:p>
+    <w:p>
+      <w:r>
+        <w:rPr>
+          <w:noProof/>
+        </w:rPr>
+        <w:drawing>
+          <wp:inline distT="0" distB="0" distL="0" distR="0" wp14:anchorId="6C002E2B" wp14:editId="5DF809ED">
+            <wp:extent cx="5486400" cy="4615543"/>
+            <wp:effectExtent l="0" t="0" r="0" b="0"/>
+            <wp:docPr id="951954119" name="Picture 951954119"/>
+            <wp:cNvGraphicFramePr>
+              <a:graphicFrameLocks xmlns:a="http://schemas.openxmlformats.org/drawingml/2006/main" noChangeAspect="1"/>
+            </wp:cNvGraphicFramePr>
+            <a:graphic xmlns:a="http://schemas.openxmlformats.org/drawingml/2006/main">
+              <a:graphicData uri="http://schemas.openxmlformats.org/drawingml/2006/picture">
+                <pic:pic xmlns:pic="http://schemas.openxmlformats.org/drawingml/2006/picture">
+                  <pic:nvPicPr>
+                    <pic:cNvPr id="0" name="image.png"/>
+                    <pic:cNvPicPr/>
+                  </pic:nvPicPr>
+                  <pic:blipFill>
+                    <a:blip r:embed="rId22"/>
+                    <a:stretch>
+                      <a:fillRect/>
+                    </a:stretch>
+                  </pic:blipFill>
+                  <pic:spPr>
+                    <a:xfrm>
+                      <a:off x="0" y="0"/>
+                      <a:ext cx="5486400" cy="4615543"/>
+                    </a:xfrm>
+                    <a:prstGeom prst="rect">
+                      <a:avLst/>
+                    </a:prstGeom>
+                  </pic:spPr>
+                </pic:pic>
+              </a:graphicData>
+            </a:graphic>
+          </wp:inline>
+        </w:drawing>
+      </w:r>
+    </w:p>
+    <w:p>
+      <w:pPr>
+        <w:pStyle w:val="Caption"/>
+      </w:pPr>
+      <w:r>
+        <w:t>Fig 5.1: Verification of the 30-minute MERGE synchronization job execution.</w:t>
+      </w:r>
+    </w:p>
+    <w:p>
+      <w:r>
+        <w:t>Following the above configuration, the subsequent setup step requires validation to ensure the applied settings propagate correctly across the active node.</w:t>
       </w:r>
     </w:p>
     <w:p>
@@ -955,7 +1940,7 @@
                     <pic:cNvPicPr/>
                   </pic:nvPicPr>
                   <pic:blipFill>
-                    <a:blip r:embed="rId19"/>
+                    <a:blip r:embed="rId23"/>
                     <a:stretch>
                       <a:fillRect/>
                     </a:stretch>
@@ -982,7 +1967,7 @@
         <w:jc w:val="center"/>
       </w:pPr>
       <w:r>
-        <w:t>Fig 5.1: Successful execution history of the 30-Minute High-Frequency Sync Job.</w:t>
+        <w:t>Fig 5.2: Successful execution history of the 30-Minute High-Frequency Sync Job.</w:t>
       </w:r>
     </w:p>
     <w:p/>
@@ -1010,7 +1995,7 @@
                     <pic:cNvPicPr/>
                   </pic:nvPicPr>
                   <pic:blipFill>
-                    <a:blip r:embed="rId20"/>
+                    <a:blip r:embed="rId24"/>
                     <a:stretch>
                       <a:fillRect/>
                     </a:stretch>
@@ -1037,21 +2022,94 @@
         <w:jc w:val="center"/>
       </w:pPr>
       <w:r>
-        <w:t>Fig 5.2: Replication Architecture Diagram mapping the bi-directional data flow.</w:t>
+        <w:t>Fig 5.3: Replication Architecture Diagram mapping the bi-directional data flow.</w:t>
+      </w:r>
+    </w:p>
+    <w:p>
+      <w:r>
+        <w:t>After securing the initial component, we execute the next validation phase to guarantee comprehensive operational visibility and data-at-rest protection.</w:t>
       </w:r>
     </w:p>
     <w:p/>
     <w:p>
-      <w:pPr>
-        <w:pStyle w:val="Heading2"/>
-      </w:pPr>
-      <w:r>
-        <w:t>6. Resource Governance &amp; Session Tracking</w:t>
+      <w:r>
+        <w:br w:type="page"/>
       </w:r>
     </w:p>
     <w:p>
-      <w:r>
-        <w:t>Resource Governor was deployed on the Secondary Node to prevent analytical reporting queries from consuming excessive system resources. A dedicated Resource Pool and Workload Group were instantiated to strictly cap CPU and Memory utilization at 20% for the designated "deploy_user". A classifier function evaluates the login and dynamically enforces these limits during the operational window.</w:t>
+      <w:pPr>
+        <w:pStyle w:val="Heading2"/>
+      </w:pPr>
+      <w:bookmarkStart w:id="6" w:name="_Toc228489274"/>
+      <w:r>
+        <w:lastRenderedPageBreak/>
+        <w:t>6. Resource Governance &amp; Session Tracking</w:t>
+      </w:r>
+      <w:bookmarkEnd w:id="6"/>
+    </w:p>
+    <w:p>
+      <w:r>
+        <w:t xml:space="preserve">Resource Governor was deployed on </w:t>
+      </w:r>
+      <w:proofErr w:type="gramStart"/>
+      <w:r>
+        <w:t>the Secondary</w:t>
+      </w:r>
+      <w:proofErr w:type="gramEnd"/>
+      <w:r>
+        <w:t xml:space="preserve"> Node to prevent analytical reporting queries from consuming excessive system resources. A dedicated Resource Pool and Workload Group were instantiated to strictly cap CPU and Memory utilization at 20% for the designated "</w:t>
+      </w:r>
+      <w:proofErr w:type="spellStart"/>
+      <w:r>
+        <w:t>deploy_user</w:t>
+      </w:r>
+      <w:proofErr w:type="spellEnd"/>
+      <w:r>
+        <w:t>". A classifier function evaluates the login and dynamically enforces these limits during the operational window.</w:t>
+      </w:r>
+    </w:p>
+    <w:p>
+      <w:r>
+        <w:t xml:space="preserve">In </w:t>
+      </w:r>
+      <w:proofErr w:type="gramStart"/>
+      <w:r>
+        <w:t>addition</w:t>
+      </w:r>
+      <w:proofErr w:type="gramEnd"/>
+      <w:r>
+        <w:t xml:space="preserve"> </w:t>
+      </w:r>
+      <w:proofErr w:type="spellStart"/>
+      <w:proofErr w:type="gramStart"/>
+      <w:r>
+        <w:t>toResource</w:t>
+      </w:r>
+      <w:proofErr w:type="spellEnd"/>
+      <w:proofErr w:type="gramEnd"/>
+      <w:r>
+        <w:t xml:space="preserve"> Governor CPU caps, we implemented 'Hard Enforcement' via a Server Logon Trigger. This trigger strictly prevents the </w:t>
+      </w:r>
+      <w:proofErr w:type="spellStart"/>
+      <w:r>
+        <w:t>deploy_user</w:t>
+      </w:r>
+      <w:proofErr w:type="spellEnd"/>
+      <w:r>
+        <w:t xml:space="preserve"> from establishing any new sessions during the 1-hour analytical window (00:00–01:00). To support audits, a persistent Session Tracking engine was deployed, logging all active user metrics to a dedicated </w:t>
+      </w:r>
+      <w:proofErr w:type="spellStart"/>
+      <w:proofErr w:type="gramStart"/>
+      <w:r>
+        <w:t>master.dbo.Session</w:t>
+      </w:r>
+      <w:proofErr w:type="gramEnd"/>
+      <w:r>
+        <w:t>_Tracking_Log</w:t>
+      </w:r>
+      <w:proofErr w:type="spellEnd"/>
+      <w:r>
+        <w:t xml:space="preserve"> table every minute.</w:t>
       </w:r>
     </w:p>
     <w:p>
@@ -1078,7 +2136,7 @@
                     <pic:cNvPicPr/>
                   </pic:nvPicPr>
                   <pic:blipFill>
-                    <a:blip r:embed="rId21"/>
+                    <a:blip r:embed="rId25"/>
                     <a:stretch>
                       <a:fillRect/>
                     </a:stretch>
@@ -1105,17 +2163,41 @@
         <w:jc w:val="center"/>
       </w:pPr>
       <w:r>
-        <w:t>Fig 6.1: Resource Governor configuration showing the limits applied to the ReportPool and DeployGroup.</w:t>
+        <w:t xml:space="preserve">Fig 6.1: Resource Governor configuration showing the limits applied to the </w:t>
+      </w:r>
+      <w:proofErr w:type="spellStart"/>
+      <w:r>
+        <w:t>ReportPool</w:t>
+      </w:r>
+      <w:proofErr w:type="spellEnd"/>
+      <w:r>
+        <w:t xml:space="preserve"> and </w:t>
+      </w:r>
+      <w:proofErr w:type="spellStart"/>
+      <w:r>
+        <w:t>DeployGroup</w:t>
+      </w:r>
+      <w:proofErr w:type="spellEnd"/>
+      <w:r>
+        <w:t>.</w:t>
       </w:r>
     </w:p>
     <w:p/>
     <w:p>
+      <w:r>
+        <w:br w:type="page"/>
+      </w:r>
+    </w:p>
+    <w:p>
       <w:pPr>
         <w:pStyle w:val="Heading2"/>
       </w:pPr>
-      <w:r>
+      <w:bookmarkStart w:id="7" w:name="_Toc228489275"/>
+      <w:r>
+        <w:lastRenderedPageBreak/>
         <w:t>7. Advanced Monitoring, Alerting &amp; Backup Audit</w:t>
       </w:r>
+      <w:bookmarkEnd w:id="7"/>
     </w:p>
     <w:p>
       <w:r>
@@ -1146,7 +2228,7 @@
                     <pic:cNvPicPr/>
                   </pic:nvPicPr>
                   <pic:blipFill>
-                    <a:blip r:embed="rId22"/>
+                    <a:blip r:embed="rId26"/>
                     <a:stretch>
                       <a:fillRect/>
                     </a:stretch>
@@ -1174,6 +2256,11 @@
       </w:pPr>
       <w:r>
         <w:t>Fig 7.1: Database Mail Log confirming successful SMTP transmission capabilities.</w:t>
+      </w:r>
+    </w:p>
+    <w:p>
+      <w:r>
+        <w:t>After securing the initial component, we execute the next validation phase to guarantee comprehensive operational visibility and data-at-rest protection.</w:t>
       </w:r>
     </w:p>
     <w:p/>
@@ -1201,7 +2288,7 @@
                     <pic:cNvPicPr/>
                   </pic:nvPicPr>
                   <pic:blipFill>
-                    <a:blip r:embed="rId23"/>
+                    <a:blip r:embed="rId27"/>
                     <a:stretch>
                       <a:fillRect/>
                     </a:stretch>
@@ -1231,6 +2318,12 @@
         <w:t>Fig 7.2: Extended Events Live Data viewer capturing a simulated blocked process.</w:t>
       </w:r>
     </w:p>
+    <w:p>
+      <w:r>
+        <w:lastRenderedPageBreak/>
+        <w:t>After securing the initial component, we execute the next validation phase to guarantee comprehensive operational visibility and data-at-rest protection.</w:t>
+      </w:r>
+    </w:p>
     <w:p/>
     <w:p>
       <w:pPr>
@@ -1240,7 +2333,6 @@
         <w:rPr>
           <w:noProof/>
         </w:rPr>
-        <w:lastRenderedPageBreak/>
         <w:drawing>
           <wp:inline distT="0" distB="0" distL="0" distR="0" wp14:anchorId="7339F9A4" wp14:editId="122AF9CC">
             <wp:extent cx="5029200" cy="957049"/>
@@ -1257,7 +2349,7 @@
                     <pic:cNvPicPr/>
                   </pic:nvPicPr>
                   <pic:blipFill>
-                    <a:blip r:embed="rId24"/>
+                    <a:blip r:embed="rId28"/>
                     <a:stretch>
                       <a:fillRect/>
                     </a:stretch>
@@ -1289,16 +2381,95 @@
     </w:p>
     <w:p/>
     <w:p>
-      <w:pPr>
-        <w:pStyle w:val="Heading2"/>
-      </w:pPr>
-      <w:r>
-        <w:t>8. Security, Auditing &amp; Encryption</w:t>
+      <w:r>
+        <w:br w:type="page"/>
       </w:r>
     </w:p>
     <w:p>
-      <w:r>
-        <w:t>A defense-in-depth security posture was enforced across the architecture. An automated self-healing script verified that all user databases are strictly owned by the "sa" principal. To achieve compliance, granular SQL Server Audits were enabled to trace and permanently log all SELECT operations executed against the sensitive HR.Employees table. Data-at-rest protection was implemented by encrypting the Salary column utilizing Symmetric Keys and Certificates. Finally, a comprehensive privilege report was generated to audit server-level and database-level roles.</w:t>
+      <w:pPr>
+        <w:pStyle w:val="Heading2"/>
+      </w:pPr>
+      <w:bookmarkStart w:id="8" w:name="_Toc228489276"/>
+      <w:r>
+        <w:lastRenderedPageBreak/>
+        <w:t>8. Security, Auditing &amp; Encryption</w:t>
+      </w:r>
+      <w:bookmarkEnd w:id="8"/>
+    </w:p>
+    <w:p>
+      <w:r>
+        <w:t xml:space="preserve">Furthermore, we implemented a Self-Healing Ownership Enforcement script. This automated routine scans all user databases; if an unauthorized owner (other than </w:t>
+      </w:r>
+      <w:proofErr w:type="spellStart"/>
+      <w:r>
+        <w:t>sa</w:t>
+      </w:r>
+      <w:proofErr w:type="spellEnd"/>
+      <w:r>
+        <w:t xml:space="preserve">) is detected, the script automatically restores ownership to </w:t>
+      </w:r>
+      <w:proofErr w:type="spellStart"/>
+      <w:r>
+        <w:t>sa</w:t>
+      </w:r>
+      <w:proofErr w:type="spellEnd"/>
+      <w:r>
+        <w:t xml:space="preserve"> and dispatches a high-priority alert via Database Mail to the Admin Operator.</w:t>
+      </w:r>
+    </w:p>
+    <w:p>
+      <w:r>
+        <w:rPr>
+          <w:noProof/>
+        </w:rPr>
+        <w:drawing>
+          <wp:inline distT="0" distB="0" distL="0" distR="0" wp14:anchorId="0FA1AEEE" wp14:editId="48C08E2B">
+            <wp:extent cx="5486400" cy="4707785"/>
+            <wp:effectExtent l="0" t="0" r="0" b="0"/>
+            <wp:docPr id="951954120" name="Picture 951954120"/>
+            <wp:cNvGraphicFramePr>
+              <a:graphicFrameLocks xmlns:a="http://schemas.openxmlformats.org/drawingml/2006/main" noChangeAspect="1"/>
+            </wp:cNvGraphicFramePr>
+            <a:graphic xmlns:a="http://schemas.openxmlformats.org/drawingml/2006/main">
+              <a:graphicData uri="http://schemas.openxmlformats.org/drawingml/2006/picture">
+                <pic:pic xmlns:pic="http://schemas.openxmlformats.org/drawingml/2006/picture">
+                  <pic:nvPicPr>
+                    <pic:cNvPr id="0" name="image.png"/>
+                    <pic:cNvPicPr/>
+                  </pic:nvPicPr>
+                  <pic:blipFill>
+                    <a:blip r:embed="rId29"/>
+                    <a:stretch>
+                      <a:fillRect/>
+                    </a:stretch>
+                  </pic:blipFill>
+                  <pic:spPr>
+                    <a:xfrm>
+                      <a:off x="0" y="0"/>
+                      <a:ext cx="5486400" cy="4707785"/>
+                    </a:xfrm>
+                    <a:prstGeom prst="rect">
+                      <a:avLst/>
+                    </a:prstGeom>
+                  </pic:spPr>
+                </pic:pic>
+              </a:graphicData>
+            </a:graphic>
+          </wp:inline>
+        </w:drawing>
+      </w:r>
+    </w:p>
+    <w:p>
+      <w:pPr>
+        <w:pStyle w:val="Caption"/>
+      </w:pPr>
+      <w:r>
+        <w:t>Fig 8.1: Successful self-healing event: Ownership restored to SA and SMTP alert dispatched.</w:t>
+      </w:r>
+    </w:p>
+    <w:p>
+      <w:r>
+        <w:t>With the automated self-healing enforcement verified, we also confirmed the granular tracking of privileged data access using SQL Server Audit.</w:t>
       </w:r>
     </w:p>
     <w:p>
@@ -1325,7 +2496,7 @@
                     <pic:cNvPicPr/>
                   </pic:nvPicPr>
                   <pic:blipFill>
-                    <a:blip r:embed="rId25"/>
+                    <a:blip r:embed="rId30"/>
                     <a:stretch>
                       <a:fillRect/>
                     </a:stretch>
@@ -1352,7 +2523,13 @@
         <w:jc w:val="center"/>
       </w:pPr>
       <w:r>
-        <w:t>Fig 8.1: SQL Server Audit Logs capturing a SELECT query against the HR schema.</w:t>
+        <w:t>Fig 8.2: SQL Server Audit Logs capturing a SELECT query against the HR schema.</w:t>
+      </w:r>
+    </w:p>
+    <w:p>
+      <w:r>
+        <w:lastRenderedPageBreak/>
+        <w:t>Following access auditing, data-at-rest protection was validated by verifying the column-level encryption applied to the HR schema.</w:t>
       </w:r>
     </w:p>
     <w:p/>
@@ -1380,7 +2557,7 @@
                     <pic:cNvPicPr/>
                   </pic:nvPicPr>
                   <pic:blipFill>
-                    <a:blip r:embed="rId26"/>
+                    <a:blip r:embed="rId31"/>
                     <a:stretch>
                       <a:fillRect/>
                     </a:stretch>
@@ -1407,7 +2584,20 @@
         <w:jc w:val="center"/>
       </w:pPr>
       <w:r>
-        <w:t>Fig 8.2: Query results demonstrating the Symmetric Key encryption of the Salary column (Ciphertext).</w:t>
+        <w:t xml:space="preserve">Fig 8.3: Query results </w:t>
+      </w:r>
+      <w:proofErr w:type="gramStart"/>
+      <w:r>
+        <w:t>demonstrating</w:t>
+      </w:r>
+      <w:proofErr w:type="gramEnd"/>
+      <w:r>
+        <w:t xml:space="preserve"> the Symmetric Key encryption of the Salary column (Ciphertext).</w:t>
+      </w:r>
+    </w:p>
+    <w:p>
+      <w:r>
+        <w:t>Finally, to ensure compliance with the principle of least privilege, a comprehensive security report was generated to audit all server and database roles.</w:t>
       </w:r>
     </w:p>
     <w:p/>
@@ -1435,7 +2625,7 @@
                     <pic:cNvPicPr/>
                   </pic:nvPicPr>
                   <pic:blipFill>
-                    <a:blip r:embed="rId27"/>
+                    <a:blip r:embed="rId32"/>
                     <a:stretch>
                       <a:fillRect/>
                     </a:stretch>
@@ -1462,11 +2652,17 @@
         <w:jc w:val="center"/>
       </w:pPr>
       <w:r>
-        <w:t>Fig 8.3: Output of the Comprehensive Security and Privilege Audit script.</w:t>
+        <w:t>Fig 8.4: Output of the Comprehensive Security and Privilege Audit script.</w:t>
       </w:r>
     </w:p>
     <w:p/>
     <w:sectPr>
+      <w:headerReference w:type="even" r:id="rId33"/>
+      <w:headerReference w:type="default" r:id="rId34"/>
+      <w:footerReference w:type="even" r:id="rId35"/>
+      <w:footerReference w:type="default" r:id="rId36"/>
+      <w:headerReference w:type="first" r:id="rId37"/>
+      <w:footerReference w:type="first" r:id="rId38"/>
       <w:pgSz w:w="12240" w:h="15840"/>
       <w:pgMar w:top="1440" w:right="1800" w:bottom="1440" w:left="1800" w:header="720" w:footer="720" w:gutter="0"/>
       <w:cols w:space="720"/>
@@ -1474,6 +2670,191 @@
     </w:sectPr>
   </w:body>
 </w:document>
+</file>
+
+<file path=word/endnotes.xml><?xml version="1.0" encoding="utf-8"?>
+<w:endnotes xmlns:wpc="http://schemas.microsoft.com/office/word/2010/wordprocessingCanvas" xmlns:cx="http://schemas.microsoft.com/office/drawing/2014/chartex" xmlns:cx1="http://schemas.microsoft.com/office/drawing/2015/9/8/chartex" xmlns:cx2="http://schemas.microsoft.com/office/drawing/2015/10/21/chartex" xmlns:cx3="http://schemas.microsoft.com/office/drawing/2016/5/9/chartex" xmlns:cx4="http://schemas.microsoft.com/office/drawing/2016/5/10/chartex" xmlns:cx5="http://schemas.microsoft.com/office/drawing/2016/5/11/chartex" xmlns:cx6="http://schemas.microsoft.com/office/drawing/2016/5/12/chartex" xmlns:cx7="http://schemas.microsoft.com/office/drawing/2016/5/13/chartex" xmlns:cx8="http://schemas.microsoft.com/office/drawing/2016/5/14/chartex" xmlns:mc="http://schemas.openxmlformats.org/markup-compatibility/2006" xmlns:aink="http://schemas.microsoft.com/office/drawing/2016/ink" xmlns:am3d="http://schemas.microsoft.com/office/drawing/2017/model3d" xmlns:o="urn:schemas-microsoft-com:office:office" xmlns:oel="http://schemas.microsoft.com/office/2019/extlst" xmlns:r="http://schemas.openxmlformats.org/officeDocument/2006/relationships" xmlns:m="http://schemas.openxmlformats.org/officeDocument/2006/math" xmlns:v="urn:schemas-microsoft-com:vml" xmlns:wp14="http://schemas.microsoft.com/office/word/2010/wordprocessingDrawing" xmlns:wp="http://schemas.openxmlformats.org/drawingml/2006/wordprocessingDrawing" xmlns:w10="urn:schemas-microsoft-com:office:word" xmlns:w="http://schemas.openxmlformats.org/wordprocessingml/2006/main" xmlns:w14="http://schemas.microsoft.com/office/word/2010/wordml" xmlns:w15="http://schemas.microsoft.com/office/word/2012/wordml" xmlns:w16cex="http://schemas.microsoft.com/office/word/2018/wordml/cex" xmlns:w16cid="http://schemas.microsoft.com/office/word/2016/wordml/cid" xmlns:w16="http://schemas.microsoft.com/office/word/2018/wordml" xmlns:w16du="http://schemas.microsoft.com/office/word/2023/wordml/word16du" xmlns:w16sdtdh="http://schemas.microsoft.com/office/word/2020/wordml/sdtdatahash" xmlns:w16sdtfl="http://schemas.microsoft.com/office/word/2024/wordml/sdtformatlock" xmlns:w16se="http://schemas.microsoft.com/office/word/2015/wordml/symex" xmlns:wpg="http://schemas.microsoft.com/office/word/2010/wordprocessingGroup" xmlns:wpi="http://schemas.microsoft.com/office/word/2010/wordprocessingInk" xmlns:wne="http://schemas.microsoft.com/office/word/2006/wordml" xmlns:wps="http://schemas.microsoft.com/office/word/2010/wordprocessingShape" mc:Ignorable="w14 w15 w16se w16cid w16 w16cex w16sdtdh w16sdtfl w16du wp14">
+  <w:endnote w:type="separator" w:id="-1">
+    <w:p>
+      <w:pPr>
+        <w:spacing w:after="0" w:line="240" w:lineRule="auto"/>
+      </w:pPr>
+      <w:r>
+        <w:separator/>
+      </w:r>
+    </w:p>
+  </w:endnote>
+  <w:endnote w:type="continuationSeparator" w:id="0">
+    <w:p>
+      <w:pPr>
+        <w:spacing w:after="0" w:line="240" w:lineRule="auto"/>
+      </w:pPr>
+      <w:r>
+        <w:continuationSeparator/>
+      </w:r>
+    </w:p>
+  </w:endnote>
+</w:endnotes>
+</file>
+
+<file path=word/footer1.xml><?xml version="1.0" encoding="utf-8"?>
+<w:ftr xmlns:wpc="http://schemas.microsoft.com/office/word/2010/wordprocessingCanvas" xmlns:cx="http://schemas.microsoft.com/office/drawing/2014/chartex" xmlns:cx1="http://schemas.microsoft.com/office/drawing/2015/9/8/chartex" xmlns:cx2="http://schemas.microsoft.com/office/drawing/2015/10/21/chartex" xmlns:cx3="http://schemas.microsoft.com/office/drawing/2016/5/9/chartex" xmlns:cx4="http://schemas.microsoft.com/office/drawing/2016/5/10/chartex" xmlns:cx5="http://schemas.microsoft.com/office/drawing/2016/5/11/chartex" xmlns:cx6="http://schemas.microsoft.com/office/drawing/2016/5/12/chartex" xmlns:cx7="http://schemas.microsoft.com/office/drawing/2016/5/13/chartex" xmlns:cx8="http://schemas.microsoft.com/office/drawing/2016/5/14/chartex" xmlns:mc="http://schemas.openxmlformats.org/markup-compatibility/2006" xmlns:aink="http://schemas.microsoft.com/office/drawing/2016/ink" xmlns:am3d="http://schemas.microsoft.com/office/drawing/2017/model3d" xmlns:o="urn:schemas-microsoft-com:office:office" xmlns:oel="http://schemas.microsoft.com/office/2019/extlst" xmlns:r="http://schemas.openxmlformats.org/officeDocument/2006/relationships" xmlns:m="http://schemas.openxmlformats.org/officeDocument/2006/math" xmlns:v="urn:schemas-microsoft-com:vml" xmlns:wp14="http://schemas.microsoft.com/office/word/2010/wordprocessingDrawing" xmlns:wp="http://schemas.openxmlformats.org/drawingml/2006/wordprocessingDrawing" xmlns:w10="urn:schemas-microsoft-com:office:word" xmlns:w="http://schemas.openxmlformats.org/wordprocessingml/2006/main" xmlns:w14="http://schemas.microsoft.com/office/word/2010/wordml" xmlns:w15="http://schemas.microsoft.com/office/word/2012/wordml" xmlns:w16cex="http://schemas.microsoft.com/office/word/2018/wordml/cex" xmlns:w16cid="http://schemas.microsoft.com/office/word/2016/wordml/cid" xmlns:w16="http://schemas.microsoft.com/office/word/2018/wordml" xmlns:w16du="http://schemas.microsoft.com/office/word/2023/wordml/word16du" xmlns:w16sdtdh="http://schemas.microsoft.com/office/word/2020/wordml/sdtdatahash" xmlns:w16sdtfl="http://schemas.microsoft.com/office/word/2024/wordml/sdtformatlock" xmlns:w16se="http://schemas.microsoft.com/office/word/2015/wordml/symex" xmlns:wpg="http://schemas.microsoft.com/office/word/2010/wordprocessingGroup" xmlns:wpi="http://schemas.microsoft.com/office/word/2010/wordprocessingInk" xmlns:wne="http://schemas.microsoft.com/office/word/2006/wordml" xmlns:wps="http://schemas.microsoft.com/office/word/2010/wordprocessingShape" mc:Ignorable="w14 w15 w16se w16cid w16 w16cex w16sdtdh w16sdtfl w16du wp14">
+  <w:p>
+    <w:pPr>
+      <w:pStyle w:val="Footer"/>
+      <w:framePr w:wrap="around" w:vAnchor="text" w:hAnchor="margin" w:xAlign="right" w:y="1"/>
+      <w:rPr>
+        <w:rStyle w:val="PageNumber"/>
+      </w:rPr>
+    </w:pPr>
+    <w:r>
+      <w:rPr>
+        <w:rStyle w:val="PageNumber"/>
+      </w:rPr>
+      <w:fldChar w:fldCharType="begin"/>
+    </w:r>
+    <w:r>
+      <w:rPr>
+        <w:rStyle w:val="PageNumber"/>
+      </w:rPr>
+      <w:instrText xml:space="preserve"> PAGE </w:instrText>
+    </w:r>
+    <w:r>
+      <w:rPr>
+        <w:rStyle w:val="PageNumber"/>
+      </w:rPr>
+      <w:fldChar w:fldCharType="separate"/>
+    </w:r>
+    <w:r>
+      <w:rPr>
+        <w:rStyle w:val="PageNumber"/>
+      </w:rPr>
+      <w:fldChar w:fldCharType="end"/>
+    </w:r>
+  </w:p>
+  <w:p>
+    <w:pPr>
+      <w:pStyle w:val="Footer"/>
+      <w:ind w:right="360"/>
+    </w:pPr>
+  </w:p>
+</w:ftr>
+</file>
+
+<file path=word/footer2.xml><?xml version="1.0" encoding="utf-8"?>
+<w:ftr xmlns:wpc="http://schemas.microsoft.com/office/word/2010/wordprocessingCanvas" xmlns:cx="http://schemas.microsoft.com/office/drawing/2014/chartex" xmlns:cx1="http://schemas.microsoft.com/office/drawing/2015/9/8/chartex" xmlns:cx2="http://schemas.microsoft.com/office/drawing/2015/10/21/chartex" xmlns:cx3="http://schemas.microsoft.com/office/drawing/2016/5/9/chartex" xmlns:cx4="http://schemas.microsoft.com/office/drawing/2016/5/10/chartex" xmlns:cx5="http://schemas.microsoft.com/office/drawing/2016/5/11/chartex" xmlns:cx6="http://schemas.microsoft.com/office/drawing/2016/5/12/chartex" xmlns:cx7="http://schemas.microsoft.com/office/drawing/2016/5/13/chartex" xmlns:cx8="http://schemas.microsoft.com/office/drawing/2016/5/14/chartex" xmlns:mc="http://schemas.openxmlformats.org/markup-compatibility/2006" xmlns:aink="http://schemas.microsoft.com/office/drawing/2016/ink" xmlns:am3d="http://schemas.microsoft.com/office/drawing/2017/model3d" xmlns:o="urn:schemas-microsoft-com:office:office" xmlns:oel="http://schemas.microsoft.com/office/2019/extlst" xmlns:r="http://schemas.openxmlformats.org/officeDocument/2006/relationships" xmlns:m="http://schemas.openxmlformats.org/officeDocument/2006/math" xmlns:v="urn:schemas-microsoft-com:vml" xmlns:wp14="http://schemas.microsoft.com/office/word/2010/wordprocessingDrawing" xmlns:wp="http://schemas.openxmlformats.org/drawingml/2006/wordprocessingDrawing" xmlns:w10="urn:schemas-microsoft-com:office:word" xmlns:w="http://schemas.openxmlformats.org/wordprocessingml/2006/main" xmlns:w14="http://schemas.microsoft.com/office/word/2010/wordml" xmlns:w15="http://schemas.microsoft.com/office/word/2012/wordml" xmlns:w16cex="http://schemas.microsoft.com/office/word/2018/wordml/cex" xmlns:w16cid="http://schemas.microsoft.com/office/word/2016/wordml/cid" xmlns:w16="http://schemas.microsoft.com/office/word/2018/wordml" xmlns:w16du="http://schemas.microsoft.com/office/word/2023/wordml/word16du" xmlns:w16sdtdh="http://schemas.microsoft.com/office/word/2020/wordml/sdtdatahash" xmlns:w16sdtfl="http://schemas.microsoft.com/office/word/2024/wordml/sdtformatlock" xmlns:w16se="http://schemas.microsoft.com/office/word/2015/wordml/symex" xmlns:wpg="http://schemas.microsoft.com/office/word/2010/wordprocessingGroup" xmlns:wpi="http://schemas.microsoft.com/office/word/2010/wordprocessingInk" xmlns:wne="http://schemas.microsoft.com/office/word/2006/wordml" xmlns:wps="http://schemas.microsoft.com/office/word/2010/wordprocessingShape" mc:Ignorable="w14 w15 w16se w16cid w16 w16cex w16sdtdh w16sdtfl w16du wp14">
+  <w:p>
+    <w:pPr>
+      <w:pStyle w:val="Footer"/>
+      <w:framePr w:wrap="around" w:vAnchor="text" w:hAnchor="margin" w:xAlign="right" w:y="1"/>
+      <w:rPr>
+        <w:rStyle w:val="PageNumber"/>
+      </w:rPr>
+    </w:pPr>
+    <w:r>
+      <w:rPr>
+        <w:rStyle w:val="PageNumber"/>
+      </w:rPr>
+      <w:fldChar w:fldCharType="begin"/>
+    </w:r>
+    <w:r>
+      <w:rPr>
+        <w:rStyle w:val="PageNumber"/>
+      </w:rPr>
+      <w:instrText xml:space="preserve"> PAGE </w:instrText>
+    </w:r>
+    <w:r>
+      <w:rPr>
+        <w:rStyle w:val="PageNumber"/>
+      </w:rPr>
+      <w:fldChar w:fldCharType="separate"/>
+    </w:r>
+    <w:r>
+      <w:rPr>
+        <w:rStyle w:val="PageNumber"/>
+        <w:noProof/>
+      </w:rPr>
+      <w:t>1</w:t>
+    </w:r>
+    <w:r>
+      <w:rPr>
+        <w:rStyle w:val="PageNumber"/>
+      </w:rPr>
+      <w:fldChar w:fldCharType="end"/>
+    </w:r>
+  </w:p>
+  <w:p>
+    <w:pPr>
+      <w:pStyle w:val="Footer"/>
+      <w:ind w:right="360"/>
+    </w:pPr>
+  </w:p>
+</w:ftr>
+</file>
+
+<file path=word/footer3.xml><?xml version="1.0" encoding="utf-8"?>
+<w:ftr xmlns:wpc="http://schemas.microsoft.com/office/word/2010/wordprocessingCanvas" xmlns:cx="http://schemas.microsoft.com/office/drawing/2014/chartex" xmlns:cx1="http://schemas.microsoft.com/office/drawing/2015/9/8/chartex" xmlns:cx2="http://schemas.microsoft.com/office/drawing/2015/10/21/chartex" xmlns:cx3="http://schemas.microsoft.com/office/drawing/2016/5/9/chartex" xmlns:cx4="http://schemas.microsoft.com/office/drawing/2016/5/10/chartex" xmlns:cx5="http://schemas.microsoft.com/office/drawing/2016/5/11/chartex" xmlns:cx6="http://schemas.microsoft.com/office/drawing/2016/5/12/chartex" xmlns:cx7="http://schemas.microsoft.com/office/drawing/2016/5/13/chartex" xmlns:cx8="http://schemas.microsoft.com/office/drawing/2016/5/14/chartex" xmlns:mc="http://schemas.openxmlformats.org/markup-compatibility/2006" xmlns:aink="http://schemas.microsoft.com/office/drawing/2016/ink" xmlns:am3d="http://schemas.microsoft.com/office/drawing/2017/model3d" xmlns:o="urn:schemas-microsoft-com:office:office" xmlns:oel="http://schemas.microsoft.com/office/2019/extlst" xmlns:r="http://schemas.openxmlformats.org/officeDocument/2006/relationships" xmlns:m="http://schemas.openxmlformats.org/officeDocument/2006/math" xmlns:v="urn:schemas-microsoft-com:vml" xmlns:wp14="http://schemas.microsoft.com/office/word/2010/wordprocessingDrawing" xmlns:wp="http://schemas.openxmlformats.org/drawingml/2006/wordprocessingDrawing" xmlns:w10="urn:schemas-microsoft-com:office:word" xmlns:w="http://schemas.openxmlformats.org/wordprocessingml/2006/main" xmlns:w14="http://schemas.microsoft.com/office/word/2010/wordml" xmlns:w15="http://schemas.microsoft.com/office/word/2012/wordml" xmlns:w16cex="http://schemas.microsoft.com/office/word/2018/wordml/cex" xmlns:w16cid="http://schemas.microsoft.com/office/word/2016/wordml/cid" xmlns:w16="http://schemas.microsoft.com/office/word/2018/wordml" xmlns:w16du="http://schemas.microsoft.com/office/word/2023/wordml/word16du" xmlns:w16sdtdh="http://schemas.microsoft.com/office/word/2020/wordml/sdtdatahash" xmlns:w16sdtfl="http://schemas.microsoft.com/office/word/2024/wordml/sdtformatlock" xmlns:w16se="http://schemas.microsoft.com/office/word/2015/wordml/symex" xmlns:wpg="http://schemas.microsoft.com/office/word/2010/wordprocessingGroup" xmlns:wpi="http://schemas.microsoft.com/office/word/2010/wordprocessingInk" xmlns:wne="http://schemas.microsoft.com/office/word/2006/wordml" xmlns:wps="http://schemas.microsoft.com/office/word/2010/wordprocessingShape" mc:Ignorable="w14 w15 w16se w16cid w16 w16cex w16sdtdh w16sdtfl w16du wp14">
+  <w:p>
+    <w:pPr>
+      <w:pStyle w:val="Footer"/>
+    </w:pPr>
+  </w:p>
+</w:ftr>
+</file>
+
+<file path=word/footnotes.xml><?xml version="1.0" encoding="utf-8"?>
+<w:footnotes xmlns:wpc="http://schemas.microsoft.com/office/word/2010/wordprocessingCanvas" xmlns:cx="http://schemas.microsoft.com/office/drawing/2014/chartex" xmlns:cx1="http://schemas.microsoft.com/office/drawing/2015/9/8/chartex" xmlns:cx2="http://schemas.microsoft.com/office/drawing/2015/10/21/chartex" xmlns:cx3="http://schemas.microsoft.com/office/drawing/2016/5/9/chartex" xmlns:cx4="http://schemas.microsoft.com/office/drawing/2016/5/10/chartex" xmlns:cx5="http://schemas.microsoft.com/office/drawing/2016/5/11/chartex" xmlns:cx6="http://schemas.microsoft.com/office/drawing/2016/5/12/chartex" xmlns:cx7="http://schemas.microsoft.com/office/drawing/2016/5/13/chartex" xmlns:cx8="http://schemas.microsoft.com/office/drawing/2016/5/14/chartex" xmlns:mc="http://schemas.openxmlformats.org/markup-compatibility/2006" xmlns:aink="http://schemas.microsoft.com/office/drawing/2016/ink" xmlns:am3d="http://schemas.microsoft.com/office/drawing/2017/model3d" xmlns:o="urn:schemas-microsoft-com:office:office" xmlns:oel="http://schemas.microsoft.com/office/2019/extlst" xmlns:r="http://schemas.openxmlformats.org/officeDocument/2006/relationships" xmlns:m="http://schemas.openxmlformats.org/officeDocument/2006/math" xmlns:v="urn:schemas-microsoft-com:vml" xmlns:wp14="http://schemas.microsoft.com/office/word/2010/wordprocessingDrawing" xmlns:wp="http://schemas.openxmlformats.org/drawingml/2006/wordprocessingDrawing" xmlns:w10="urn:schemas-microsoft-com:office:word" xmlns:w="http://schemas.openxmlformats.org/wordprocessingml/2006/main" xmlns:w14="http://schemas.microsoft.com/office/word/2010/wordml" xmlns:w15="http://schemas.microsoft.com/office/word/2012/wordml" xmlns:w16cex="http://schemas.microsoft.com/office/word/2018/wordml/cex" xmlns:w16cid="http://schemas.microsoft.com/office/word/2016/wordml/cid" xmlns:w16="http://schemas.microsoft.com/office/word/2018/wordml" xmlns:w16du="http://schemas.microsoft.com/office/word/2023/wordml/word16du" xmlns:w16sdtdh="http://schemas.microsoft.com/office/word/2020/wordml/sdtdatahash" xmlns:w16sdtfl="http://schemas.microsoft.com/office/word/2024/wordml/sdtformatlock" xmlns:w16se="http://schemas.microsoft.com/office/word/2015/wordml/symex" xmlns:wpg="http://schemas.microsoft.com/office/word/2010/wordprocessingGroup" xmlns:wpi="http://schemas.microsoft.com/office/word/2010/wordprocessingInk" xmlns:wne="http://schemas.microsoft.com/office/word/2006/wordml" xmlns:wps="http://schemas.microsoft.com/office/word/2010/wordprocessingShape" mc:Ignorable="w14 w15 w16se w16cid w16 w16cex w16sdtdh w16sdtfl w16du wp14">
+  <w:footnote w:type="separator" w:id="-1">
+    <w:p>
+      <w:pPr>
+        <w:spacing w:after="0" w:line="240" w:lineRule="auto"/>
+      </w:pPr>
+      <w:r>
+        <w:separator/>
+      </w:r>
+    </w:p>
+  </w:footnote>
+  <w:footnote w:type="continuationSeparator" w:id="0">
+    <w:p>
+      <w:pPr>
+        <w:spacing w:after="0" w:line="240" w:lineRule="auto"/>
+      </w:pPr>
+      <w:r>
+        <w:continuationSeparator/>
+      </w:r>
+    </w:p>
+  </w:footnote>
+</w:footnotes>
+</file>
+
+<file path=word/header1.xml><?xml version="1.0" encoding="utf-8"?>
+<w:hdr xmlns:wpc="http://schemas.microsoft.com/office/word/2010/wordprocessingCanvas" xmlns:cx="http://schemas.microsoft.com/office/drawing/2014/chartex" xmlns:cx1="http://schemas.microsoft.com/office/drawing/2015/9/8/chartex" xmlns:cx2="http://schemas.microsoft.com/office/drawing/2015/10/21/chartex" xmlns:cx3="http://schemas.microsoft.com/office/drawing/2016/5/9/chartex" xmlns:cx4="http://schemas.microsoft.com/office/drawing/2016/5/10/chartex" xmlns:cx5="http://schemas.microsoft.com/office/drawing/2016/5/11/chartex" xmlns:cx6="http://schemas.microsoft.com/office/drawing/2016/5/12/chartex" xmlns:cx7="http://schemas.microsoft.com/office/drawing/2016/5/13/chartex" xmlns:cx8="http://schemas.microsoft.com/office/drawing/2016/5/14/chartex" xmlns:mc="http://schemas.openxmlformats.org/markup-compatibility/2006" xmlns:aink="http://schemas.microsoft.com/office/drawing/2016/ink" xmlns:am3d="http://schemas.microsoft.com/office/drawing/2017/model3d" xmlns:o="urn:schemas-microsoft-com:office:office" xmlns:oel="http://schemas.microsoft.com/office/2019/extlst" xmlns:r="http://schemas.openxmlformats.org/officeDocument/2006/relationships" xmlns:m="http://schemas.openxmlformats.org/officeDocument/2006/math" xmlns:v="urn:schemas-microsoft-com:vml" xmlns:wp14="http://schemas.microsoft.com/office/word/2010/wordprocessingDrawing" xmlns:wp="http://schemas.openxmlformats.org/drawingml/2006/wordprocessingDrawing" xmlns:w10="urn:schemas-microsoft-com:office:word" xmlns:w="http://schemas.openxmlformats.org/wordprocessingml/2006/main" xmlns:w14="http://schemas.microsoft.com/office/word/2010/wordml" xmlns:w15="http://schemas.microsoft.com/office/word/2012/wordml" xmlns:w16cex="http://schemas.microsoft.com/office/word/2018/wordml/cex" xmlns:w16cid="http://schemas.microsoft.com/office/word/2016/wordml/cid" xmlns:w16="http://schemas.microsoft.com/office/word/2018/wordml" xmlns:w16du="http://schemas.microsoft.com/office/word/2023/wordml/word16du" xmlns:w16sdtdh="http://schemas.microsoft.com/office/word/2020/wordml/sdtdatahash" xmlns:w16sdtfl="http://schemas.microsoft.com/office/word/2024/wordml/sdtformatlock" xmlns:w16se="http://schemas.microsoft.com/office/word/2015/wordml/symex" xmlns:wpg="http://schemas.microsoft.com/office/word/2010/wordprocessingGroup" xmlns:wpi="http://schemas.microsoft.com/office/word/2010/wordprocessingInk" xmlns:wne="http://schemas.microsoft.com/office/word/2006/wordml" xmlns:wps="http://schemas.microsoft.com/office/word/2010/wordprocessingShape" mc:Ignorable="w14 w15 w16se w16cid w16 w16cex w16sdtdh w16sdtfl w16du wp14">
+  <w:p>
+    <w:pPr>
+      <w:pStyle w:val="Header"/>
+    </w:pPr>
+  </w:p>
+</w:hdr>
+</file>
+
+<file path=word/header2.xml><?xml version="1.0" encoding="utf-8"?>
+<w:hdr xmlns:wpc="http://schemas.microsoft.com/office/word/2010/wordprocessingCanvas" xmlns:cx="http://schemas.microsoft.com/office/drawing/2014/chartex" xmlns:cx1="http://schemas.microsoft.com/office/drawing/2015/9/8/chartex" xmlns:cx2="http://schemas.microsoft.com/office/drawing/2015/10/21/chartex" xmlns:cx3="http://schemas.microsoft.com/office/drawing/2016/5/9/chartex" xmlns:cx4="http://schemas.microsoft.com/office/drawing/2016/5/10/chartex" xmlns:cx5="http://schemas.microsoft.com/office/drawing/2016/5/11/chartex" xmlns:cx6="http://schemas.microsoft.com/office/drawing/2016/5/12/chartex" xmlns:cx7="http://schemas.microsoft.com/office/drawing/2016/5/13/chartex" xmlns:cx8="http://schemas.microsoft.com/office/drawing/2016/5/14/chartex" xmlns:mc="http://schemas.openxmlformats.org/markup-compatibility/2006" xmlns:aink="http://schemas.microsoft.com/office/drawing/2016/ink" xmlns:am3d="http://schemas.microsoft.com/office/drawing/2017/model3d" xmlns:o="urn:schemas-microsoft-com:office:office" xmlns:oel="http://schemas.microsoft.com/office/2019/extlst" xmlns:r="http://schemas.openxmlformats.org/officeDocument/2006/relationships" xmlns:m="http://schemas.openxmlformats.org/officeDocument/2006/math" xmlns:v="urn:schemas-microsoft-com:vml" xmlns:wp14="http://schemas.microsoft.com/office/word/2010/wordprocessingDrawing" xmlns:wp="http://schemas.openxmlformats.org/drawingml/2006/wordprocessingDrawing" xmlns:w10="urn:schemas-microsoft-com:office:word" xmlns:w="http://schemas.openxmlformats.org/wordprocessingml/2006/main" xmlns:w14="http://schemas.microsoft.com/office/word/2010/wordml" xmlns:w15="http://schemas.microsoft.com/office/word/2012/wordml" xmlns:w16cex="http://schemas.microsoft.com/office/word/2018/wordml/cex" xmlns:w16cid="http://schemas.microsoft.com/office/word/2016/wordml/cid" xmlns:w16="http://schemas.microsoft.com/office/word/2018/wordml" xmlns:w16du="http://schemas.microsoft.com/office/word/2023/wordml/word16du" xmlns:w16sdtdh="http://schemas.microsoft.com/office/word/2020/wordml/sdtdatahash" xmlns:w16sdtfl="http://schemas.microsoft.com/office/word/2024/wordml/sdtformatlock" xmlns:w16se="http://schemas.microsoft.com/office/word/2015/wordml/symex" xmlns:wpg="http://schemas.microsoft.com/office/word/2010/wordprocessingGroup" xmlns:wpi="http://schemas.microsoft.com/office/word/2010/wordprocessingInk" xmlns:wne="http://schemas.microsoft.com/office/word/2006/wordml" xmlns:wps="http://schemas.microsoft.com/office/word/2010/wordprocessingShape" mc:Ignorable="w14 w15 w16se w16cid w16 w16cex w16sdtdh w16sdtfl w16du wp14">
+  <w:p>
+    <w:pPr>
+      <w:pStyle w:val="Header"/>
+    </w:pPr>
+  </w:p>
+</w:hdr>
+</file>
+
+<file path=word/header3.xml><?xml version="1.0" encoding="utf-8"?>
+<w:hdr xmlns:wpc="http://schemas.microsoft.com/office/word/2010/wordprocessingCanvas" xmlns:cx="http://schemas.microsoft.com/office/drawing/2014/chartex" xmlns:cx1="http://schemas.microsoft.com/office/drawing/2015/9/8/chartex" xmlns:cx2="http://schemas.microsoft.com/office/drawing/2015/10/21/chartex" xmlns:cx3="http://schemas.microsoft.com/office/drawing/2016/5/9/chartex" xmlns:cx4="http://schemas.microsoft.com/office/drawing/2016/5/10/chartex" xmlns:cx5="http://schemas.microsoft.com/office/drawing/2016/5/11/chartex" xmlns:cx6="http://schemas.microsoft.com/office/drawing/2016/5/12/chartex" xmlns:cx7="http://schemas.microsoft.com/office/drawing/2016/5/13/chartex" xmlns:cx8="http://schemas.microsoft.com/office/drawing/2016/5/14/chartex" xmlns:mc="http://schemas.openxmlformats.org/markup-compatibility/2006" xmlns:aink="http://schemas.microsoft.com/office/drawing/2016/ink" xmlns:am3d="http://schemas.microsoft.com/office/drawing/2017/model3d" xmlns:o="urn:schemas-microsoft-com:office:office" xmlns:oel="http://schemas.microsoft.com/office/2019/extlst" xmlns:r="http://schemas.openxmlformats.org/officeDocument/2006/relationships" xmlns:m="http://schemas.openxmlformats.org/officeDocument/2006/math" xmlns:v="urn:schemas-microsoft-com:vml" xmlns:wp14="http://schemas.microsoft.com/office/word/2010/wordprocessingDrawing" xmlns:wp="http://schemas.openxmlformats.org/drawingml/2006/wordprocessingDrawing" xmlns:w10="urn:schemas-microsoft-com:office:word" xmlns:w="http://schemas.openxmlformats.org/wordprocessingml/2006/main" xmlns:w14="http://schemas.microsoft.com/office/word/2010/wordml" xmlns:w15="http://schemas.microsoft.com/office/word/2012/wordml" xmlns:w16cex="http://schemas.microsoft.com/office/word/2018/wordml/cex" xmlns:w16cid="http://schemas.microsoft.com/office/word/2016/wordml/cid" xmlns:w16="http://schemas.microsoft.com/office/word/2018/wordml" xmlns:w16du="http://schemas.microsoft.com/office/word/2023/wordml/word16du" xmlns:w16sdtdh="http://schemas.microsoft.com/office/word/2020/wordml/sdtdatahash" xmlns:w16sdtfl="http://schemas.microsoft.com/office/word/2024/wordml/sdtformatlock" xmlns:w16se="http://schemas.microsoft.com/office/word/2015/wordml/symex" xmlns:wpg="http://schemas.microsoft.com/office/word/2010/wordprocessingGroup" xmlns:wpi="http://schemas.microsoft.com/office/word/2010/wordprocessingInk" xmlns:wne="http://schemas.microsoft.com/office/word/2006/wordml" xmlns:wps="http://schemas.microsoft.com/office/word/2010/wordprocessingShape" mc:Ignorable="w14 w15 w16se w16cid w16 w16cex w16sdtdh w16sdtfl w16du wp14">
+  <w:p>
+    <w:pPr>
+      <w:pStyle w:val="Header"/>
+    </w:pPr>
+  </w:p>
+</w:hdr>
 </file>
 
 <file path=word/numbering.xml><?xml version="1.0" encoding="utf-8"?>
@@ -2072,7 +3453,7 @@
     <w:rPr>
       <w:i/>
       <w:color w:val="646464"/>
-      <w:sz w:val="16"/>
+      <w:sz w:val="24"/>
     </w:rPr>
   </w:style>
   <w:style w:type="paragraph" w:styleId="Heading1">
@@ -2283,6 +3664,7 @@
   <w:style w:type="character" w:default="1" w:styleId="DefaultParagraphFont">
     <w:name w:val="Default Paragraph Font"/>
     <w:uiPriority w:val="1"/>
+    <w:semiHidden/>
     <w:unhideWhenUsed/>
   </w:style>
   <w:style w:type="table" w:default="1" w:styleId="TableNormal">
@@ -2459,7 +3841,6 @@
       <w:iCs/>
       <w:color w:val="4F81BD" w:themeColor="accent1"/>
       <w:spacing w:val="15"/>
-      <w:sz w:val="24"/>
       <w:szCs w:val="24"/>
     </w:rPr>
   </w:style>
@@ -13076,6 +14457,39 @@
       <w:color w:val="605E5C"/>
       <w:shd w:val="clear" w:color="auto" w:fill="E1DFDD"/>
     </w:rPr>
+  </w:style>
+  <w:style w:type="character" w:styleId="PageNumber">
+    <w:name w:val="page number"/>
+    <w:basedOn w:val="DefaultParagraphFont"/>
+    <w:uiPriority w:val="99"/>
+    <w:semiHidden/>
+    <w:unhideWhenUsed/>
+    <w:rsid w:val="00F875CB"/>
+  </w:style>
+  <w:style w:type="paragraph" w:styleId="TOC1">
+    <w:name w:val="toc 1"/>
+    <w:basedOn w:val="Normal"/>
+    <w:next w:val="Normal"/>
+    <w:autoRedefine/>
+    <w:uiPriority w:val="39"/>
+    <w:unhideWhenUsed/>
+    <w:rsid w:val="00F875CB"/>
+    <w:pPr>
+      <w:spacing w:after="100"/>
+    </w:pPr>
+  </w:style>
+  <w:style w:type="paragraph" w:styleId="TOC2">
+    <w:name w:val="toc 2"/>
+    <w:basedOn w:val="Normal"/>
+    <w:next w:val="Normal"/>
+    <w:autoRedefine/>
+    <w:uiPriority w:val="39"/>
+    <w:unhideWhenUsed/>
+    <w:rsid w:val="00F875CB"/>
+    <w:pPr>
+      <w:spacing w:after="100"/>
+      <w:ind w:left="240"/>
+    </w:pPr>
   </w:style>
 </w:styles>
 </file>

</xml_diff>

<commit_message>
``` Update README and restructure scripts for clarity
- Updated README to reflect script numbering changes (01-99).
- Reorganized and enhanced governance and monitoring script.
- Added advanced monitoring script for performance tuning and backup
  audits.
- Replaced and improved security and encryption scripts.
- Removed outdated operational audits script.
  ```
</commit_message>
<xml_diff>
--- a/Report.docx
+++ b/Report.docx
@@ -257,7 +257,7 @@
         <w:rPr>
           <w:noProof/>
         </w:rPr>
-        <w:instrText xml:space="preserve"> PAGEREF _Toc228489268 \h </w:instrText>
+        <w:instrText xml:space="preserve"> PAGEREF _Toc228533480 \h </w:instrText>
       </w:r>
       <w:r>
         <w:rPr>
@@ -314,7 +314,36 @@
         <w:rPr>
           <w:noProof/>
         </w:rPr>
+        <w:fldChar w:fldCharType="begin"/>
+      </w:r>
+      <w:r>
+        <w:rPr>
+          <w:noProof/>
+        </w:rPr>
+        <w:instrText xml:space="preserve"> PAGEREF _Toc228533481 \h </w:instrText>
+      </w:r>
+      <w:r>
+        <w:rPr>
+          <w:noProof/>
+        </w:rPr>
+      </w:r>
+      <w:r>
+        <w:rPr>
+          <w:noProof/>
+        </w:rPr>
+        <w:fldChar w:fldCharType="separate"/>
+      </w:r>
+      <w:r>
+        <w:rPr>
+          <w:noProof/>
+        </w:rPr>
         <w:t>3</w:t>
+      </w:r>
+      <w:r>
+        <w:rPr>
+          <w:noProof/>
+        </w:rPr>
+        <w:fldChar w:fldCharType="end"/>
       </w:r>
     </w:p>
     <w:p>
@@ -354,7 +383,7 @@
         <w:rPr>
           <w:noProof/>
         </w:rPr>
-        <w:instrText xml:space="preserve"> PAGEREF _Toc228489270 \h </w:instrText>
+        <w:instrText xml:space="preserve"> PAGEREF _Toc228533482 \h </w:instrText>
       </w:r>
       <w:r>
         <w:rPr>
@@ -417,7 +446,7 @@
         <w:rPr>
           <w:noProof/>
         </w:rPr>
-        <w:instrText xml:space="preserve"> PAGEREF _Toc228489271 \h </w:instrText>
+        <w:instrText xml:space="preserve"> PAGEREF _Toc228533483 \h </w:instrText>
       </w:r>
       <w:r>
         <w:rPr>
@@ -462,7 +491,7 @@
         <w:rPr>
           <w:noProof/>
         </w:rPr>
-        <w:t>4. Automated Maintenance Plan</w:t>
+        <w:t>4. Replication &amp; Analytical Data Flow</w:t>
       </w:r>
       <w:r>
         <w:rPr>
@@ -480,7 +509,7 @@
         <w:rPr>
           <w:noProof/>
         </w:rPr>
-        <w:instrText xml:space="preserve"> PAGEREF _Toc228489272 \h </w:instrText>
+        <w:instrText xml:space="preserve"> PAGEREF _Toc228533484 \h </w:instrText>
       </w:r>
       <w:r>
         <w:rPr>
@@ -525,7 +554,7 @@
         <w:rPr>
           <w:noProof/>
         </w:rPr>
-        <w:t>5. Replication &amp; Analytical Data Flow</w:t>
+        <w:t>5. Automated Maintenance Plan</w:t>
       </w:r>
       <w:r>
         <w:rPr>
@@ -543,7 +572,7 @@
         <w:rPr>
           <w:noProof/>
         </w:rPr>
-        <w:instrText xml:space="preserve"> PAGEREF _Toc228489273 \h </w:instrText>
+        <w:instrText xml:space="preserve"> PAGEREF _Toc228533485 \h </w:instrText>
       </w:r>
       <w:r>
         <w:rPr>
@@ -588,7 +617,7 @@
         <w:rPr>
           <w:noProof/>
         </w:rPr>
-        <w:t>6. Resource Governance &amp; Session Tracking</w:t>
+        <w:t>7. Resource Governance &amp; Session Tracking</w:t>
       </w:r>
       <w:r>
         <w:rPr>
@@ -606,7 +635,7 @@
         <w:rPr>
           <w:noProof/>
         </w:rPr>
-        <w:instrText xml:space="preserve"> PAGEREF _Toc228489274 \h </w:instrText>
+        <w:instrText xml:space="preserve"> PAGEREF _Toc228533486 \h </w:instrText>
       </w:r>
       <w:r>
         <w:rPr>
@@ -651,7 +680,7 @@
         <w:rPr>
           <w:noProof/>
         </w:rPr>
-        <w:t>7. Advanced Monitoring, Alerting &amp; Backup Audit</w:t>
+        <w:t>8. Advanced Monitoring &amp; Optimization</w:t>
       </w:r>
       <w:r>
         <w:rPr>
@@ -669,7 +698,7 @@
         <w:rPr>
           <w:noProof/>
         </w:rPr>
-        <w:instrText xml:space="preserve"> PAGEREF _Toc228489275 \h </w:instrText>
+        <w:instrText xml:space="preserve"> PAGEREF _Toc228533487 \h </w:instrText>
       </w:r>
       <w:r>
         <w:rPr>
@@ -686,7 +715,7 @@
         <w:rPr>
           <w:noProof/>
         </w:rPr>
-        <w:t>14</w:t>
+        <w:t>15</w:t>
       </w:r>
       <w:r>
         <w:rPr>
@@ -714,7 +743,7 @@
         <w:rPr>
           <w:noProof/>
         </w:rPr>
-        <w:t>8. Security, Auditing &amp; Encryption</w:t>
+        <w:t>9. Security, Auditing &amp; Encryption</w:t>
       </w:r>
       <w:r>
         <w:rPr>
@@ -732,7 +761,7 @@
         <w:rPr>
           <w:noProof/>
         </w:rPr>
-        <w:instrText xml:space="preserve"> PAGEREF _Toc228489276 \h </w:instrText>
+        <w:instrText xml:space="preserve"> PAGEREF _Toc228533488 \h </w:instrText>
       </w:r>
       <w:r>
         <w:rPr>
@@ -785,7 +814,7 @@
       <w:pPr>
         <w:pStyle w:val="Heading1"/>
       </w:pPr>
-      <w:bookmarkStart w:id="0" w:name="_Toc228489268"/>
+      <w:bookmarkStart w:id="0" w:name="_Toc228533480"/>
       <w:r>
         <w:t>Executive Summary</w:t>
       </w:r>
@@ -824,11 +853,13 @@
       <w:pPr>
         <w:pStyle w:val="Heading2"/>
       </w:pPr>
+      <w:bookmarkStart w:id="2" w:name="_Toc228533481"/>
       <w:r>
         <w:lastRenderedPageBreak/>
         <w:t>1. Infrastructure Deployment &amp; Connections</w:t>
       </w:r>
       <w:bookmarkEnd w:id="1"/>
+      <w:bookmarkEnd w:id="2"/>
     </w:p>
     <w:p>
       <w:r>
@@ -961,12 +992,14 @@
       <w:pPr>
         <w:pStyle w:val="Heading2"/>
       </w:pPr>
-      <w:bookmarkStart w:id="2" w:name="_Toc228489270"/>
+      <w:bookmarkStart w:id="3" w:name="_Toc228489270"/>
+      <w:bookmarkStart w:id="4" w:name="_Toc228533482"/>
       <w:r>
         <w:lastRenderedPageBreak/>
         <w:t>2. System Configuration &amp; Schema Design</w:t>
       </w:r>
-      <w:bookmarkEnd w:id="2"/>
+      <w:bookmarkEnd w:id="3"/>
+      <w:bookmarkEnd w:id="4"/>
     </w:p>
     <w:p>
       <w:proofErr w:type="spellStart"/>
@@ -1458,12 +1491,14 @@
       <w:pPr>
         <w:pStyle w:val="Heading2"/>
       </w:pPr>
-      <w:bookmarkStart w:id="3" w:name="_Toc228489271"/>
+      <w:bookmarkStart w:id="5" w:name="_Toc228489271"/>
+      <w:bookmarkStart w:id="6" w:name="_Toc228533483"/>
       <w:r>
         <w:lastRenderedPageBreak/>
         <w:t>3. Backup Strategy &amp; Workflow</w:t>
       </w:r>
-      <w:bookmarkEnd w:id="3"/>
+      <w:bookmarkEnd w:id="5"/>
+      <w:bookmarkEnd w:id="6"/>
     </w:p>
     <w:p>
       <w:r>
@@ -1687,24 +1722,34 @@
       <w:pPr>
         <w:pStyle w:val="Heading2"/>
       </w:pPr>
-      <w:bookmarkStart w:id="4" w:name="_Toc228489272"/>
+      <w:bookmarkStart w:id="7" w:name="_Toc228489273"/>
+      <w:bookmarkStart w:id="8" w:name="_Toc228533484"/>
       <w:r>
         <w:lastRenderedPageBreak/>
-        <w:t>4. Automated Maintenance Plan</w:t>
-      </w:r>
-      <w:bookmarkEnd w:id="4"/>
+        <w:t>4. Replication &amp; Analytical Data Flow</w:t>
+      </w:r>
+      <w:bookmarkEnd w:id="7"/>
+      <w:bookmarkEnd w:id="8"/>
     </w:p>
     <w:p>
       <w:r>
-        <w:t xml:space="preserve">To eliminate resource contention, we transitioned from independent schedules to Chained Maintenance. The SQL Agent job now sequences a Full </w:t>
+        <w:t xml:space="preserve">We implemented a robust, idempotent data synchronization pipeline using Linked Servers and the SQL MERGE statement. Unlike a standard INSERT, this logic ensures that the </w:t>
       </w:r>
       <w:proofErr w:type="spellStart"/>
       <w:r>
-        <w:t>Backup</w:t>
+        <w:t>ReportDB</w:t>
       </w:r>
       <w:proofErr w:type="spellEnd"/>
       <w:r>
-        <w:t xml:space="preserve"> before performing high-impact tasks like DBCC CHECKDB and Index Reorganization. This ensures we have a valid recovery point before any heavy maintenance operations begin.</w:t>
+        <w:t xml:space="preserve"> on the Secondary Node is a true mirror of the </w:t>
+      </w:r>
+      <w:proofErr w:type="spellStart"/>
+      <w:r>
+        <w:t>CoreDB</w:t>
+      </w:r>
+      <w:proofErr w:type="spellEnd"/>
+      <w:r>
+        <w:t>, handling record updates and deletions automatically.</w:t>
       </w:r>
     </w:p>
     <w:p>
@@ -1713,10 +1758,10 @@
           <w:noProof/>
         </w:rPr>
         <w:drawing>
-          <wp:inline distT="0" distB="0" distL="0" distR="0" wp14:anchorId="6A26783A" wp14:editId="7516BD79">
-            <wp:extent cx="5486400" cy="4442460"/>
+          <wp:inline distT="0" distB="0" distL="0" distR="0" wp14:anchorId="6C002E2B" wp14:editId="5DF809ED">
+            <wp:extent cx="5486400" cy="4615543"/>
             <wp:effectExtent l="0" t="0" r="0" b="0"/>
-            <wp:docPr id="951954118" name="Picture 951954118"/>
+            <wp:docPr id="951954119" name="Picture 951954119"/>
             <wp:cNvGraphicFramePr>
               <a:graphicFrameLocks xmlns:a="http://schemas.openxmlformats.org/drawingml/2006/main" noChangeAspect="1"/>
             </wp:cNvGraphicFramePr>
@@ -1736,159 +1781,6 @@
                   <pic:spPr>
                     <a:xfrm>
                       <a:off x="0" y="0"/>
-                      <a:ext cx="5486400" cy="4442460"/>
-                    </a:xfrm>
-                    <a:prstGeom prst="rect">
-                      <a:avLst/>
-                    </a:prstGeom>
-                  </pic:spPr>
-                </pic:pic>
-              </a:graphicData>
-            </a:graphic>
-          </wp:inline>
-        </w:drawing>
-      </w:r>
-    </w:p>
-    <w:p>
-      <w:pPr>
-        <w:pStyle w:val="Caption"/>
-      </w:pPr>
-      <w:r>
-        <w:t>Fig 4.1: Chained maintenance workflow showing Backup-to-Maintenance sequencing.</w:t>
-      </w:r>
-    </w:p>
-    <w:p>
-      <w:r>
-        <w:t>Following the above configuration, the subsequent setup step requires validation to ensure the applied settings propagate correctly across the active node.</w:t>
-      </w:r>
-    </w:p>
-    <w:p>
-      <w:pPr>
-        <w:jc w:val="center"/>
-      </w:pPr>
-      <w:r>
-        <w:rPr>
-          <w:noProof/>
-        </w:rPr>
-        <w:drawing>
-          <wp:inline distT="0" distB="0" distL="0" distR="0" wp14:anchorId="7CBF6763" wp14:editId="55EE4AD5">
-            <wp:extent cx="5029200" cy="1135801"/>
-            <wp:effectExtent l="0" t="0" r="0" b="0"/>
-            <wp:docPr id="12" name="Picture 12"/>
-            <wp:cNvGraphicFramePr>
-              <a:graphicFrameLocks xmlns:a="http://schemas.openxmlformats.org/drawingml/2006/main" noChangeAspect="1"/>
-            </wp:cNvGraphicFramePr>
-            <a:graphic xmlns:a="http://schemas.openxmlformats.org/drawingml/2006/main">
-              <a:graphicData uri="http://schemas.openxmlformats.org/drawingml/2006/picture">
-                <pic:pic xmlns:pic="http://schemas.openxmlformats.org/drawingml/2006/picture">
-                  <pic:nvPicPr>
-                    <pic:cNvPr id="0" name="12.png"/>
-                    <pic:cNvPicPr/>
-                  </pic:nvPicPr>
-                  <pic:blipFill>
-                    <a:blip r:embed="rId21"/>
-                    <a:stretch>
-                      <a:fillRect/>
-                    </a:stretch>
-                  </pic:blipFill>
-                  <pic:spPr>
-                    <a:xfrm>
-                      <a:off x="0" y="0"/>
-                      <a:ext cx="5029200" cy="1135801"/>
-                    </a:xfrm>
-                    <a:prstGeom prst="rect">
-                      <a:avLst/>
-                    </a:prstGeom>
-                  </pic:spPr>
-                </pic:pic>
-              </a:graphicData>
-            </a:graphic>
-          </wp:inline>
-        </w:drawing>
-      </w:r>
-    </w:p>
-    <w:p>
-      <w:pPr>
-        <w:pStyle w:val="Caption"/>
-        <w:jc w:val="center"/>
-      </w:pPr>
-      <w:r>
-        <w:t>Fig 4.2: The sequential steps of the WEEKLY_DB_MAINTENANCE SQL Agent Job.</w:t>
-      </w:r>
-    </w:p>
-    <w:p>
-      <w:r>
-        <w:lastRenderedPageBreak/>
-        <w:t>Following the above configuration, the subsequent setup step requires validation to ensure the applied settings propagate correctly across the active node.</w:t>
-      </w:r>
-    </w:p>
-    <w:p/>
-    <w:p>
-      <w:r>
-        <w:br w:type="page"/>
-      </w:r>
-    </w:p>
-    <w:p>
-      <w:pPr>
-        <w:pStyle w:val="Heading2"/>
-      </w:pPr>
-      <w:bookmarkStart w:id="5" w:name="_Toc228489273"/>
-      <w:r>
-        <w:lastRenderedPageBreak/>
-        <w:t>5. Replication &amp; Analytical Data Flow</w:t>
-      </w:r>
-      <w:bookmarkEnd w:id="5"/>
-    </w:p>
-    <w:p>
-      <w:r>
-        <w:t xml:space="preserve">We implemented a robust, idempotent data synchronization pipeline using Linked Servers and the SQL MERGE statement. Unlike a standard INSERT, this logic ensures that the </w:t>
-      </w:r>
-      <w:proofErr w:type="spellStart"/>
-      <w:r>
-        <w:t>ReportDB</w:t>
-      </w:r>
-      <w:proofErr w:type="spellEnd"/>
-      <w:r>
-        <w:t xml:space="preserve"> on the Secondary Node is a true mirror of the </w:t>
-      </w:r>
-      <w:proofErr w:type="spellStart"/>
-      <w:r>
-        <w:t>CoreDB</w:t>
-      </w:r>
-      <w:proofErr w:type="spellEnd"/>
-      <w:r>
-        <w:t>, handling record updates and deletions automatically.</w:t>
-      </w:r>
-    </w:p>
-    <w:p>
-      <w:r>
-        <w:rPr>
-          <w:noProof/>
-        </w:rPr>
-        <w:drawing>
-          <wp:inline distT="0" distB="0" distL="0" distR="0" wp14:anchorId="6C002E2B" wp14:editId="5DF809ED">
-            <wp:extent cx="5486400" cy="4615543"/>
-            <wp:effectExtent l="0" t="0" r="0" b="0"/>
-            <wp:docPr id="951954119" name="Picture 951954119"/>
-            <wp:cNvGraphicFramePr>
-              <a:graphicFrameLocks xmlns:a="http://schemas.openxmlformats.org/drawingml/2006/main" noChangeAspect="1"/>
-            </wp:cNvGraphicFramePr>
-            <a:graphic xmlns:a="http://schemas.openxmlformats.org/drawingml/2006/main">
-              <a:graphicData uri="http://schemas.openxmlformats.org/drawingml/2006/picture">
-                <pic:pic xmlns:pic="http://schemas.openxmlformats.org/drawingml/2006/picture">
-                  <pic:nvPicPr>
-                    <pic:cNvPr id="0" name="image.png"/>
-                    <pic:cNvPicPr/>
-                  </pic:nvPicPr>
-                  <pic:blipFill>
-                    <a:blip r:embed="rId22"/>
-                    <a:stretch>
-                      <a:fillRect/>
-                    </a:stretch>
-                  </pic:blipFill>
-                  <pic:spPr>
-                    <a:xfrm>
-                      <a:off x="0" y="0"/>
                       <a:ext cx="5486400" cy="4615543"/>
                     </a:xfrm>
                     <a:prstGeom prst="rect">
@@ -1907,7 +1799,7 @@
         <w:pStyle w:val="Caption"/>
       </w:pPr>
       <w:r>
-        <w:t>Fig 5.1: Verification of the 30-minute MERGE synchronization job execution.</w:t>
+        <w:t>Fig 4.1: Verification of the 30-minute MERGE synchronization job execution.</w:t>
       </w:r>
     </w:p>
     <w:p>
@@ -1940,7 +1832,7 @@
                     <pic:cNvPicPr/>
                   </pic:nvPicPr>
                   <pic:blipFill>
-                    <a:blip r:embed="rId23"/>
+                    <a:blip r:embed="rId21"/>
                     <a:stretch>
                       <a:fillRect/>
                     </a:stretch>
@@ -1967,7 +1859,7 @@
         <w:jc w:val="center"/>
       </w:pPr>
       <w:r>
-        <w:t>Fig 5.2: Successful execution history of the 30-Minute High-Frequency Sync Job.</w:t>
+        <w:t>Fig 4.2: Successful execution history of the 30-Minute High-Frequency Sync Job.</w:t>
       </w:r>
     </w:p>
     <w:p/>
@@ -1995,7 +1887,7 @@
                     <pic:cNvPicPr/>
                   </pic:nvPicPr>
                   <pic:blipFill>
-                    <a:blip r:embed="rId24"/>
+                    <a:blip r:embed="rId22"/>
                     <a:stretch>
                       <a:fillRect/>
                     </a:stretch>
@@ -2022,7 +1914,7 @@
         <w:jc w:val="center"/>
       </w:pPr>
       <w:r>
-        <w:t>Fig 5.3: Replication Architecture Diagram mapping the bi-directional data flow.</w:t>
+        <w:t>Fig 4.3: Replication Architecture Diagram mapping the bi-directional data flow.</w:t>
       </w:r>
     </w:p>
     <w:p>
@@ -2040,36 +1932,274 @@
       <w:pPr>
         <w:pStyle w:val="Heading2"/>
       </w:pPr>
-      <w:bookmarkStart w:id="6" w:name="_Toc228489274"/>
+      <w:bookmarkStart w:id="9" w:name="_Toc228489272"/>
+      <w:bookmarkStart w:id="10" w:name="_Toc228533485"/>
       <w:r>
         <w:lastRenderedPageBreak/>
-        <w:t>6. Resource Governance &amp; Session Tracking</w:t>
-      </w:r>
-      <w:bookmarkEnd w:id="6"/>
+        <w:t>5. Automated Maintenance Plan</w:t>
+      </w:r>
+      <w:bookmarkEnd w:id="9"/>
+      <w:bookmarkEnd w:id="10"/>
     </w:p>
     <w:p>
       <w:r>
-        <w:t xml:space="preserve">Resource Governor was deployed on </w:t>
-      </w:r>
-      <w:proofErr w:type="gramStart"/>
-      <w:r>
-        <w:t>the Secondary</w:t>
-      </w:r>
-      <w:proofErr w:type="gramEnd"/>
-      <w:r>
-        <w:t xml:space="preserve"> Node to prevent analytical reporting queries from consuming excessive system resources. A dedicated Resource Pool and Workload Group were instantiated to strictly cap CPU and Memory utilization at 20% for the designated "</w:t>
+        <w:t xml:space="preserve">To eliminate resource contention, we transitioned from independent schedules to Chained Maintenance. The SQL Agent job now sequences a Full </w:t>
       </w:r>
       <w:proofErr w:type="spellStart"/>
       <w:r>
-        <w:t>deploy_user</w:t>
+        <w:t>Backup</w:t>
       </w:r>
       <w:proofErr w:type="spellEnd"/>
       <w:r>
-        <w:t>". A classifier function evaluates the login and dynamically enforces these limits during the operational window.</w:t>
+        <w:t xml:space="preserve"> before performing high-impact tasks like DBCC CHECKDB and Index Reorganization. This ensures we have a valid recovery point before any heavy maintenance operations begin.</w:t>
       </w:r>
     </w:p>
     <w:p>
       <w:r>
+        <w:rPr>
+          <w:noProof/>
+        </w:rPr>
+        <w:drawing>
+          <wp:inline distT="0" distB="0" distL="0" distR="0" wp14:anchorId="6A26783A" wp14:editId="7516BD79">
+            <wp:extent cx="5486400" cy="4442460"/>
+            <wp:effectExtent l="0" t="0" r="0" b="0"/>
+            <wp:docPr id="951954118" name="Picture 951954118"/>
+            <wp:cNvGraphicFramePr>
+              <a:graphicFrameLocks xmlns:a="http://schemas.openxmlformats.org/drawingml/2006/main" noChangeAspect="1"/>
+            </wp:cNvGraphicFramePr>
+            <a:graphic xmlns:a="http://schemas.openxmlformats.org/drawingml/2006/main">
+              <a:graphicData uri="http://schemas.openxmlformats.org/drawingml/2006/picture">
+                <pic:pic xmlns:pic="http://schemas.openxmlformats.org/drawingml/2006/picture">
+                  <pic:nvPicPr>
+                    <pic:cNvPr id="0" name="image.png"/>
+                    <pic:cNvPicPr/>
+                  </pic:nvPicPr>
+                  <pic:blipFill>
+                    <a:blip r:embed="rId23"/>
+                    <a:stretch>
+                      <a:fillRect/>
+                    </a:stretch>
+                  </pic:blipFill>
+                  <pic:spPr>
+                    <a:xfrm>
+                      <a:off x="0" y="0"/>
+                      <a:ext cx="5486400" cy="4442460"/>
+                    </a:xfrm>
+                    <a:prstGeom prst="rect">
+                      <a:avLst/>
+                    </a:prstGeom>
+                  </pic:spPr>
+                </pic:pic>
+              </a:graphicData>
+            </a:graphic>
+          </wp:inline>
+        </w:drawing>
+      </w:r>
+    </w:p>
+    <w:p>
+      <w:pPr>
+        <w:pStyle w:val="Caption"/>
+      </w:pPr>
+      <w:r>
+        <w:t>Fig 5.1: Chained maintenance workflow showing Backup-to-Maintenance sequencing.</w:t>
+      </w:r>
+    </w:p>
+    <w:p>
+      <w:r>
+        <w:t>Following the above configuration, the subsequent setup step requires validation to ensure the applied settings propagate correctly across the active node.</w:t>
+      </w:r>
+    </w:p>
+    <w:p>
+      <w:pPr>
+        <w:jc w:val="center"/>
+      </w:pPr>
+      <w:r>
+        <w:rPr>
+          <w:noProof/>
+        </w:rPr>
+        <w:drawing>
+          <wp:inline distT="0" distB="0" distL="0" distR="0" wp14:anchorId="7CBF6763" wp14:editId="55EE4AD5">
+            <wp:extent cx="5029200" cy="1135801"/>
+            <wp:effectExtent l="0" t="0" r="0" b="0"/>
+            <wp:docPr id="12" name="Picture 12"/>
+            <wp:cNvGraphicFramePr>
+              <a:graphicFrameLocks xmlns:a="http://schemas.openxmlformats.org/drawingml/2006/main" noChangeAspect="1"/>
+            </wp:cNvGraphicFramePr>
+            <a:graphic xmlns:a="http://schemas.openxmlformats.org/drawingml/2006/main">
+              <a:graphicData uri="http://schemas.openxmlformats.org/drawingml/2006/picture">
+                <pic:pic xmlns:pic="http://schemas.openxmlformats.org/drawingml/2006/picture">
+                  <pic:nvPicPr>
+                    <pic:cNvPr id="0" name="12.png"/>
+                    <pic:cNvPicPr/>
+                  </pic:nvPicPr>
+                  <pic:blipFill>
+                    <a:blip r:embed="rId24"/>
+                    <a:stretch>
+                      <a:fillRect/>
+                    </a:stretch>
+                  </pic:blipFill>
+                  <pic:spPr>
+                    <a:xfrm>
+                      <a:off x="0" y="0"/>
+                      <a:ext cx="5029200" cy="1135801"/>
+                    </a:xfrm>
+                    <a:prstGeom prst="rect">
+                      <a:avLst/>
+                    </a:prstGeom>
+                  </pic:spPr>
+                </pic:pic>
+              </a:graphicData>
+            </a:graphic>
+          </wp:inline>
+        </w:drawing>
+      </w:r>
+    </w:p>
+    <w:p>
+      <w:pPr>
+        <w:pStyle w:val="Caption"/>
+        <w:jc w:val="center"/>
+      </w:pPr>
+      <w:r>
+        <w:t>Fig 5.2: The sequential steps of the WEEKLY_DB_MAINTENANCE SQL Agent Job.</w:t>
+      </w:r>
+    </w:p>
+    <w:p>
+      <w:r>
+        <w:lastRenderedPageBreak/>
+        <w:t>Following the above configuration, the subsequent setup step requires validation to ensure the applied settings propagate correctly across the active node.</w:t>
+      </w:r>
+    </w:p>
+    <w:p/>
+    <w:p>
+      <w:r>
+        <w:br w:type="page"/>
+      </w:r>
+    </w:p>
+    <w:p>
+      <w:pPr>
+        <w:jc w:val="center"/>
+      </w:pPr>
+      <w:r>
+        <w:rPr>
+          <w:noProof/>
+        </w:rPr>
+        <w:lastRenderedPageBreak/>
+        <w:drawing>
+          <wp:inline distT="0" distB="0" distL="0" distR="0" wp14:anchorId="37FDEE04" wp14:editId="23A0D464">
+            <wp:extent cx="5029200" cy="2655784"/>
+            <wp:effectExtent l="0" t="0" r="0" b="0"/>
+            <wp:docPr id="16" name="Picture 16"/>
+            <wp:cNvGraphicFramePr>
+              <a:graphicFrameLocks xmlns:a="http://schemas.openxmlformats.org/drawingml/2006/main" noChangeAspect="1"/>
+            </wp:cNvGraphicFramePr>
+            <a:graphic xmlns:a="http://schemas.openxmlformats.org/drawingml/2006/main">
+              <a:graphicData uri="http://schemas.openxmlformats.org/drawingml/2006/picture">
+                <pic:pic xmlns:pic="http://schemas.openxmlformats.org/drawingml/2006/picture">
+                  <pic:nvPicPr>
+                    <pic:cNvPr id="0" name="16.png"/>
+                    <pic:cNvPicPr/>
+                  </pic:nvPicPr>
+                  <pic:blipFill>
+                    <a:blip r:embed="rId25"/>
+                    <a:stretch>
+                      <a:fillRect/>
+                    </a:stretch>
+                  </pic:blipFill>
+                  <pic:spPr>
+                    <a:xfrm>
+                      <a:off x="0" y="0"/>
+                      <a:ext cx="5029200" cy="2655784"/>
+                    </a:xfrm>
+                    <a:prstGeom prst="rect">
+                      <a:avLst/>
+                    </a:prstGeom>
+                  </pic:spPr>
+                </pic:pic>
+              </a:graphicData>
+            </a:graphic>
+          </wp:inline>
+        </w:drawing>
+      </w:r>
+    </w:p>
+    <w:p>
+      <w:pPr>
+        <w:pStyle w:val="Caption"/>
+        <w:jc w:val="center"/>
+      </w:pPr>
+      <w:r>
+        <w:t>Fig 6.1: Database Mail Log confirming successful SMTP transmission capabilities.</w:t>
+      </w:r>
+    </w:p>
+    <w:p>
+      <w:r>
+        <w:t>After securing the initial component, we execute the next validation phase to guarantee comprehensive operational visibility and data-at-rest protection.</w:t>
+      </w:r>
+    </w:p>
+    <w:p/>
+    <w:p>
+      <w:pPr>
+        <w:jc w:val="center"/>
+      </w:pPr>
+      <w:r>
+        <w:rPr>
+          <w:noProof/>
+        </w:rPr>
+        <w:drawing>
+          <wp:inline distT="0" distB="0" distL="0" distR="0" wp14:anchorId="6C00B7FF" wp14:editId="729FB043">
+            <wp:extent cx="5029200" cy="2073897"/>
+            <wp:effectExtent l="0" t="0" r="0" b="0"/>
+            <wp:docPr id="17" name="Picture 17"/>
+            <wp:cNvGraphicFramePr>
+              <a:graphicFrameLocks xmlns:a="http://schemas.openxmlformats.org/drawingml/2006/main" noChangeAspect="1"/>
+            </wp:cNvGraphicFramePr>
+            <a:graphic xmlns:a="http://schemas.openxmlformats.org/drawingml/2006/main">
+              <a:graphicData uri="http://schemas.openxmlformats.org/drawingml/2006/picture">
+                <pic:pic xmlns:pic="http://schemas.openxmlformats.org/drawingml/2006/picture">
+                  <pic:nvPicPr>
+                    <pic:cNvPr id="0" name="17.png"/>
+                    <pic:cNvPicPr/>
+                  </pic:nvPicPr>
+                  <pic:blipFill>
+                    <a:blip r:embed="rId26"/>
+                    <a:stretch>
+                      <a:fillRect/>
+                    </a:stretch>
+                  </pic:blipFill>
+                  <pic:spPr>
+                    <a:xfrm>
+                      <a:off x="0" y="0"/>
+                      <a:ext cx="5029200" cy="2073897"/>
+                    </a:xfrm>
+                    <a:prstGeom prst="rect">
+                      <a:avLst/>
+                    </a:prstGeom>
+                  </pic:spPr>
+                </pic:pic>
+              </a:graphicData>
+            </a:graphic>
+          </wp:inline>
+        </w:drawing>
+      </w:r>
+    </w:p>
+    <w:p>
+      <w:pPr>
+        <w:pStyle w:val="Heading2"/>
+      </w:pPr>
+      <w:bookmarkStart w:id="11" w:name="_Toc228489274"/>
+      <w:bookmarkStart w:id="12" w:name="_Toc228533486"/>
+      <w:r>
+        <w:t>7. Resource Governance &amp; Session Tracking</w:t>
+      </w:r>
+      <w:bookmarkEnd w:id="11"/>
+      <w:bookmarkEnd w:id="12"/>
+    </w:p>
+    <w:p>
+      <w:r>
+        <w:t>Resource Governor was deployed on the Secondary Node to prevent analytical reporting queries from consuming excessive system resources. A dedicated Resource Pool and Workload Group were instantiated to strictly enforce a Hard Limit using CAP_CPU_PERCENT = 20 to strictly prevent the ReportPool from exceeding 20% CPU for the designated "deploy_user". A classifier function evaluates the login and dynamically enforces these limits during the operational window.</w:t>
+      </w:r>
+    </w:p>
+    <w:p>
+      <w:r>
         <w:t xml:space="preserve">In </w:t>
       </w:r>
       <w:proofErr w:type="gramStart"/>
@@ -2096,7 +2226,11 @@
       </w:r>
       <w:proofErr w:type="spellEnd"/>
       <w:r>
-        <w:t xml:space="preserve"> from establishing any new sessions during the 1-hour analytical window (00:00–01:00). To support audits, a persistent Session Tracking engine was deployed, logging all active user metrics to a dedicated </w:t>
+        <w:t xml:space="preserve"> from establishing </w:t>
+      </w:r>
+      <w:r>
+        <w:lastRenderedPageBreak/>
+        <w:t xml:space="preserve">any new sessions during the 1-hour analytical window (00:00–01:00). To support audits, a persistent Session Tracking engine was deployed, logging all active user metrics to a dedicated </w:t>
       </w:r>
       <w:proofErr w:type="spellStart"/>
       <w:proofErr w:type="gramStart"/>
@@ -2136,7 +2270,7 @@
                     <pic:cNvPicPr/>
                   </pic:nvPicPr>
                   <pic:blipFill>
-                    <a:blip r:embed="rId25"/>
+                    <a:blip r:embed="rId27"/>
                     <a:stretch>
                       <a:fillRect/>
                     </a:stretch>
@@ -2163,7 +2297,7 @@
         <w:jc w:val="center"/>
       </w:pPr>
       <w:r>
-        <w:t xml:space="preserve">Fig 6.1: Resource Governor configuration showing the limits applied to the </w:t>
+        <w:t xml:space="preserve">Fig 7.1: Resource Governor configuration showing the limits applied to the </w:t>
       </w:r>
       <w:proofErr w:type="spellStart"/>
       <w:r>
@@ -2192,135 +2326,31 @@
       <w:pPr>
         <w:pStyle w:val="Heading2"/>
       </w:pPr>
-      <w:bookmarkStart w:id="7" w:name="_Toc228489275"/>
+      <w:bookmarkStart w:id="13" w:name="_Toc228489275"/>
+      <w:bookmarkStart w:id="14" w:name="_Toc228533487"/>
       <w:r>
         <w:lastRenderedPageBreak/>
-        <w:t>7. Advanced Monitoring, Alerting &amp; Backup Audit</w:t>
-      </w:r>
-      <w:bookmarkEnd w:id="7"/>
+        <w:t>8. Advanced Monitoring &amp; Optimization</w:t>
+      </w:r>
+      <w:bookmarkEnd w:id="13"/>
+      <w:bookmarkEnd w:id="14"/>
     </w:p>
     <w:p>
       <w:r>
-        <w:t>Proactive monitoring infrastructure was configured utilizing Database Mail connected securely via a Brevo SMTP relay. SQL Server Agent Alerts were established to automatically notify the DBA Team distribution list upon detecting Deadlocks or Blocked Processes. Blocked processes are tracked via Extended Events configured with a strict 5-second latency threshold. Furthermore, a custom stored procedure was developed to audit the operational status (Success/Failure) of all backup jobs into a centralized log table.</w:t>
+        <w:t>Extended Events (Blocks.xel) were explicitly deployed as an advanced performance tuning step (Script 07) to capture blocked processes for root-cause analysis. Furthermore, a custom stored procedure was developed to audit the operational status (Success/Failure) of all scheduled backup jobs by querying msdb.dbo.sysjobhistory instead of backupset. Failed backup jobs are not recorded in the backupset table. By querying sysjobhistory, we successfully track both the SUCCESS and FAILURE of all scheduled backup jobs, ensuring 100% monitoring coverage.</w:t>
       </w:r>
     </w:p>
     <w:p>
       <w:pPr>
+        <w:pStyle w:val="Caption"/>
         <w:jc w:val="center"/>
       </w:pPr>
       <w:r>
-        <w:rPr>
-          <w:noProof/>
-        </w:rPr>
-        <w:drawing>
-          <wp:inline distT="0" distB="0" distL="0" distR="0" wp14:anchorId="37FDEE04" wp14:editId="23A0D464">
-            <wp:extent cx="5029200" cy="2655784"/>
-            <wp:effectExtent l="0" t="0" r="0" b="0"/>
-            <wp:docPr id="16" name="Picture 16"/>
-            <wp:cNvGraphicFramePr>
-              <a:graphicFrameLocks xmlns:a="http://schemas.openxmlformats.org/drawingml/2006/main" noChangeAspect="1"/>
-            </wp:cNvGraphicFramePr>
-            <a:graphic xmlns:a="http://schemas.openxmlformats.org/drawingml/2006/main">
-              <a:graphicData uri="http://schemas.openxmlformats.org/drawingml/2006/picture">
-                <pic:pic xmlns:pic="http://schemas.openxmlformats.org/drawingml/2006/picture">
-                  <pic:nvPicPr>
-                    <pic:cNvPr id="0" name="16.png"/>
-                    <pic:cNvPicPr/>
-                  </pic:nvPicPr>
-                  <pic:blipFill>
-                    <a:blip r:embed="rId26"/>
-                    <a:stretch>
-                      <a:fillRect/>
-                    </a:stretch>
-                  </pic:blipFill>
-                  <pic:spPr>
-                    <a:xfrm>
-                      <a:off x="0" y="0"/>
-                      <a:ext cx="5029200" cy="2655784"/>
-                    </a:xfrm>
-                    <a:prstGeom prst="rect">
-                      <a:avLst/>
-                    </a:prstGeom>
-                  </pic:spPr>
-                </pic:pic>
-              </a:graphicData>
-            </a:graphic>
-          </wp:inline>
-        </w:drawing>
+        <w:t>Fig 8.1: Extended Events Live Data viewer capturing a simulated blocked process.</w:t>
       </w:r>
     </w:p>
     <w:p>
-      <w:pPr>
-        <w:pStyle w:val="Caption"/>
-        <w:jc w:val="center"/>
-      </w:pPr>
-      <w:r>
-        <w:t>Fig 7.1: Database Mail Log confirming successful SMTP transmission capabilities.</w:t>
-      </w:r>
-    </w:p>
-    <w:p>
-      <w:r>
-        <w:t>After securing the initial component, we execute the next validation phase to guarantee comprehensive operational visibility and data-at-rest protection.</w:t>
-      </w:r>
-    </w:p>
-    <w:p/>
-    <w:p>
-      <w:pPr>
-        <w:jc w:val="center"/>
-      </w:pPr>
-      <w:r>
-        <w:rPr>
-          <w:noProof/>
-        </w:rPr>
-        <w:drawing>
-          <wp:inline distT="0" distB="0" distL="0" distR="0" wp14:anchorId="6C00B7FF" wp14:editId="729FB043">
-            <wp:extent cx="5029200" cy="2073897"/>
-            <wp:effectExtent l="0" t="0" r="0" b="0"/>
-            <wp:docPr id="17" name="Picture 17"/>
-            <wp:cNvGraphicFramePr>
-              <a:graphicFrameLocks xmlns:a="http://schemas.openxmlformats.org/drawingml/2006/main" noChangeAspect="1"/>
-            </wp:cNvGraphicFramePr>
-            <a:graphic xmlns:a="http://schemas.openxmlformats.org/drawingml/2006/main">
-              <a:graphicData uri="http://schemas.openxmlformats.org/drawingml/2006/picture">
-                <pic:pic xmlns:pic="http://schemas.openxmlformats.org/drawingml/2006/picture">
-                  <pic:nvPicPr>
-                    <pic:cNvPr id="0" name="17.png"/>
-                    <pic:cNvPicPr/>
-                  </pic:nvPicPr>
-                  <pic:blipFill>
-                    <a:blip r:embed="rId27"/>
-                    <a:stretch>
-                      <a:fillRect/>
-                    </a:stretch>
-                  </pic:blipFill>
-                  <pic:spPr>
-                    <a:xfrm>
-                      <a:off x="0" y="0"/>
-                      <a:ext cx="5029200" cy="2073897"/>
-                    </a:xfrm>
-                    <a:prstGeom prst="rect">
-                      <a:avLst/>
-                    </a:prstGeom>
-                  </pic:spPr>
-                </pic:pic>
-              </a:graphicData>
-            </a:graphic>
-          </wp:inline>
-        </w:drawing>
-      </w:r>
-    </w:p>
-    <w:p>
-      <w:pPr>
-        <w:pStyle w:val="Caption"/>
-        <w:jc w:val="center"/>
-      </w:pPr>
-      <w:r>
-        <w:t>Fig 7.2: Extended Events Live Data viewer capturing a simulated blocked process.</w:t>
-      </w:r>
-    </w:p>
-    <w:p>
-      <w:r>
-        <w:lastRenderedPageBreak/>
+      <w:r>
         <w:t>After securing the initial component, we execute the next validation phase to guarantee comprehensive operational visibility and data-at-rest protection.</w:t>
       </w:r>
     </w:p>
@@ -2376,7 +2406,7 @@
         <w:jc w:val="center"/>
       </w:pPr>
       <w:r>
-        <w:t>Fig 7.3: The BACKUP_AUDIT_LOG table displaying successfully tracked backup operations.</w:t>
+        <w:t>Fig 8.2: The BACKUP_AUDIT_LOG table displaying successfully tracked backup operations.</w:t>
       </w:r>
     </w:p>
     <w:p/>
@@ -2389,32 +2419,18 @@
       <w:pPr>
         <w:pStyle w:val="Heading2"/>
       </w:pPr>
-      <w:bookmarkStart w:id="8" w:name="_Toc228489276"/>
+      <w:bookmarkStart w:id="15" w:name="_Toc228489276"/>
+      <w:bookmarkStart w:id="16" w:name="_Toc228533488"/>
       <w:r>
         <w:lastRenderedPageBreak/>
-        <w:t>8. Security, Auditing &amp; Encryption</w:t>
-      </w:r>
-      <w:bookmarkEnd w:id="8"/>
+        <w:t>9. Security, Auditing &amp; Encryption</w:t>
+      </w:r>
+      <w:bookmarkEnd w:id="15"/>
+      <w:bookmarkEnd w:id="16"/>
     </w:p>
     <w:p>
       <w:r>
-        <w:t xml:space="preserve">Furthermore, we implemented a Self-Healing Ownership Enforcement script. This automated routine scans all user databases; if an unauthorized owner (other than </w:t>
-      </w:r>
-      <w:proofErr w:type="spellStart"/>
-      <w:r>
-        <w:t>sa</w:t>
-      </w:r>
-      <w:proofErr w:type="spellEnd"/>
-      <w:r>
-        <w:t xml:space="preserve">) is detected, the script automatically restores ownership to </w:t>
-      </w:r>
-      <w:proofErr w:type="spellStart"/>
-      <w:r>
-        <w:t>sa</w:t>
-      </w:r>
-      <w:proofErr w:type="spellEnd"/>
-      <w:r>
-        <w:t xml:space="preserve"> and dispatches a high-priority alert via Database Mail to the Admin Operator.</w:t>
+        <w:t>Furthermore, we implemented a Self-Healing Ownership Enforcement script. This is automated by creating a dedicated stored procedure (SP_ENFORCE_DB_OWNERSHIP) wrapped in a daily SQL Server Agent Job (ENFORCE_OWNERSHIP_JOB) that rigorously checks for NOT IN ('sa', 'dbo') and scans all user databases; if an unauthorized owner (other than sa) is detected, the script automatically restores ownership to sa and dispatches a high-priority alert via Database Mail to the Admin Operator.</w:t>
       </w:r>
     </w:p>
     <w:p>
@@ -2464,7 +2480,7 @@
         <w:pStyle w:val="Caption"/>
       </w:pPr>
       <w:r>
-        <w:t>Fig 8.1: Successful self-healing event: Ownership restored to SA and SMTP alert dispatched.</w:t>
+        <w:t>Fig 9.1: Successful self-healing event: Ownership restored to SA and SMTP alert dispatched.</w:t>
       </w:r>
     </w:p>
     <w:p>
@@ -2523,13 +2539,13 @@
         <w:jc w:val="center"/>
       </w:pPr>
       <w:r>
-        <w:t>Fig 8.2: SQL Server Audit Logs capturing a SELECT query against the HR schema.</w:t>
+        <w:lastRenderedPageBreak/>
+        <w:t>Fig 9.2: SQL Server Audit Logs capturing a SELECT query against the HR schema.</w:t>
       </w:r>
     </w:p>
     <w:p>
       <w:r>
-        <w:lastRenderedPageBreak/>
-        <w:t>Following access auditing, data-at-rest protection was validated by verifying the column-level encryption applied to the HR schema.</w:t>
+        <w:t>Following access auditing, data-at-rest protection was validated by verifying the column-level encryption applied to the HR schema. Furthermore, Transparent Data Encryption (TDE) was successfully deployed across CoreDB, StagingDB, and ReportDB to provide robust disk-level security.</w:t>
       </w:r>
     </w:p>
     <w:p/>
@@ -2584,7 +2600,7 @@
         <w:jc w:val="center"/>
       </w:pPr>
       <w:r>
-        <w:t xml:space="preserve">Fig 8.3: Query results </w:t>
+        <w:t xml:space="preserve">Fig 9.3: Query results </w:t>
       </w:r>
       <w:proofErr w:type="gramStart"/>
       <w:r>
@@ -2597,7 +2613,7 @@
     </w:p>
     <w:p>
       <w:r>
-        <w:t>Finally, to ensure compliance with the principle of least privilege, a comprehensive security report was generated to audit all server and database roles.</w:t>
+        <w:t>Finally, to ensure compliance with the principle of least privilege, a comprehensive security report (99_security_report.sql) was generated to dynamically audit all user databases on the server, producing a cross-database map of explicit permissions and role memberships, rather than just checking a single database.</w:t>
       </w:r>
     </w:p>
     <w:p/>
@@ -2652,7 +2668,7 @@
         <w:jc w:val="center"/>
       </w:pPr>
       <w:r>
-        <w:t>Fig 8.4: Output of the Comprehensive Security and Privilege Audit script.</w:t>
+        <w:t>Fig 9.4: Output of the Comprehensive Security and Privilege Audit script.</w:t>
       </w:r>
     </w:p>
     <w:p/>

</xml_diff>